<commit_message>
AMNT-0011: add inverse median filter knowledge cards
</commit_message>
<xml_diff>
--- a/materials/ТЗ/ТЗ_Міжкадровийv2_попіксельний_медіанний_фільтр_лише.docx
+++ b/materials/ТЗ/ТЗ_Міжкадровийv2_попіксельний_медіанний_фільтр_лише.docx
@@ -128,9 +128,923 @@
           <w:u w:val="single"/>
           <w:lang w:val="uk-UA"/>
         </w:rPr>
-        <w:t>ArbitraryK8bit</w:t>
-      </w:r>
-      <w:r>
+        <w:t>ArbitraryK8bit поки можна не реалізовувати</w:t>
+      </w:r>
+    </w:p>
+    <w:p>
+      <w:pPr>
+        <w:widowControl w:val="0"/>
+        <w:spacing w:after="0" w:line="240" w:lineRule="auto"/>
+        <w:jc w:val="center"/>
+        <w:rPr>
+          <w:rFonts w:cs="Times New Roman"/>
+          <w:lang w:val="uk-UA"/>
+        </w:rPr>
+      </w:pPr>
+    </w:p>
+    <w:p>
+      <w:pPr>
+        <w:widowControl w:val="0"/>
+        <w:spacing w:after="0" w:line="240" w:lineRule="auto"/>
+        <w:rPr>
+          <w:rFonts w:cs="Times New Roman"/>
+          <w:lang w:val="uk-UA"/>
+        </w:rPr>
+      </w:pPr>
+      <w:r>
+        <w:rPr>
+          <w:rFonts w:cs="Times New Roman"/>
+          <w:b/>
+          <w:lang w:val="uk-UA"/>
+        </w:rPr>
+        <w:t>1. Призначення</w:t>
+      </w:r>
+    </w:p>
+    <w:p>
+      <w:pPr>
+        <w:widowControl w:val="0"/>
+        <w:spacing w:after="0" w:line="240" w:lineRule="auto"/>
+        <w:rPr>
+          <w:rFonts w:cs="Times New Roman"/>
+          <w:lang w:val="uk-UA"/>
+        </w:rPr>
+      </w:pPr>
+      <w:r>
+        <w:rPr>
+          <w:rFonts w:cs="Times New Roman"/>
+          <w:lang w:val="uk-UA"/>
+        </w:rPr>
+        <w:t xml:space="preserve">Реалізувати модуль, який для </w:t>
+      </w:r>
+      <w:proofErr w:type="spellStart"/>
+      <w:r>
+        <w:rPr>
+          <w:rFonts w:cs="Times New Roman"/>
+          <w:lang w:val="uk-UA"/>
+        </w:rPr>
+        <w:t>відеопотоку</w:t>
+      </w:r>
+      <w:proofErr w:type="spellEnd"/>
+      <w:r>
+        <w:rPr>
+          <w:rFonts w:cs="Times New Roman"/>
+          <w:lang w:val="uk-UA"/>
+        </w:rPr>
+        <w:t xml:space="preserve"> обчислює </w:t>
+      </w:r>
+      <w:proofErr w:type="spellStart"/>
+      <w:r>
+        <w:rPr>
+          <w:rFonts w:cs="Times New Roman"/>
+          <w:lang w:val="uk-UA"/>
+        </w:rPr>
+        <w:t>міжкадрову</w:t>
+      </w:r>
+      <w:proofErr w:type="spellEnd"/>
+      <w:r>
+        <w:rPr>
+          <w:rFonts w:cs="Times New Roman"/>
+          <w:lang w:val="uk-UA"/>
+        </w:rPr>
+        <w:t xml:space="preserve"> </w:t>
+      </w:r>
+      <w:proofErr w:type="spellStart"/>
+      <w:r>
+        <w:rPr>
+          <w:rFonts w:cs="Times New Roman"/>
+          <w:lang w:val="uk-UA"/>
+        </w:rPr>
+        <w:t>попіксельну</w:t>
+      </w:r>
+      <w:proofErr w:type="spellEnd"/>
+      <w:r>
+        <w:rPr>
+          <w:rFonts w:cs="Times New Roman"/>
+          <w:lang w:val="uk-UA"/>
+        </w:rPr>
+        <w:t xml:space="preserve"> медіану (лише по часу, без просторового вікна) та формує різницевий кадр (</w:t>
+      </w:r>
+      <w:proofErr w:type="spellStart"/>
+      <w:r>
+        <w:rPr>
+          <w:rFonts w:cs="Times New Roman"/>
+          <w:lang w:val="uk-UA"/>
+        </w:rPr>
+        <w:t>residual</w:t>
+      </w:r>
+      <w:proofErr w:type="spellEnd"/>
+      <w:r>
+        <w:rPr>
+          <w:rFonts w:cs="Times New Roman"/>
+          <w:lang w:val="uk-UA"/>
+        </w:rPr>
+        <w:t xml:space="preserve">) для подальшої обробки в </w:t>
+      </w:r>
+      <w:proofErr w:type="spellStart"/>
+      <w:r>
+        <w:rPr>
+          <w:rFonts w:cs="Times New Roman"/>
+          <w:lang w:val="uk-UA"/>
+        </w:rPr>
+        <w:t>pipeline</w:t>
+      </w:r>
+      <w:proofErr w:type="spellEnd"/>
+      <w:r>
+        <w:rPr>
+          <w:rFonts w:cs="Times New Roman"/>
+          <w:lang w:val="uk-UA"/>
+        </w:rPr>
+        <w:t>:</w:t>
+      </w:r>
+    </w:p>
+    <w:p>
+      <w:pPr>
+        <w:widowControl w:val="0"/>
+        <w:spacing w:after="0" w:line="240" w:lineRule="auto"/>
+        <w:rPr>
+          <w:rFonts w:cs="Times New Roman"/>
+          <w:lang w:val="uk-UA"/>
+        </w:rPr>
+      </w:pPr>
+      <w:proofErr w:type="spellStart"/>
+      <w:r>
+        <w:rPr>
+          <w:rFonts w:cs="Times New Roman"/>
+          <w:lang w:val="uk-UA"/>
+        </w:rPr>
+        <w:t>R_t</w:t>
+      </w:r>
+      <w:proofErr w:type="spellEnd"/>
+      <w:r>
+        <w:rPr>
+          <w:rFonts w:cs="Times New Roman"/>
+          <w:lang w:val="uk-UA"/>
+        </w:rPr>
+        <w:t>(</w:t>
+      </w:r>
+      <w:proofErr w:type="spellStart"/>
+      <w:r>
+        <w:rPr>
+          <w:rFonts w:cs="Times New Roman"/>
+          <w:lang w:val="uk-UA"/>
+        </w:rPr>
+        <w:t>x,y</w:t>
+      </w:r>
+      <w:proofErr w:type="spellEnd"/>
+      <w:r>
+        <w:rPr>
+          <w:rFonts w:cs="Times New Roman"/>
+          <w:lang w:val="uk-UA"/>
+        </w:rPr>
+        <w:t xml:space="preserve">) = </w:t>
+      </w:r>
+      <w:proofErr w:type="spellStart"/>
+      <w:r>
+        <w:rPr>
+          <w:rFonts w:cs="Times New Roman"/>
+          <w:lang w:val="uk-UA"/>
+        </w:rPr>
+        <w:t>I_t</w:t>
+      </w:r>
+      <w:proofErr w:type="spellEnd"/>
+      <w:r>
+        <w:rPr>
+          <w:rFonts w:cs="Times New Roman"/>
+          <w:lang w:val="uk-UA"/>
+        </w:rPr>
+        <w:t>(</w:t>
+      </w:r>
+      <w:proofErr w:type="spellStart"/>
+      <w:r>
+        <w:rPr>
+          <w:rFonts w:cs="Times New Roman"/>
+          <w:lang w:val="uk-UA"/>
+        </w:rPr>
+        <w:t>x,y</w:t>
+      </w:r>
+      <w:proofErr w:type="spellEnd"/>
+      <w:r>
+        <w:rPr>
+          <w:rFonts w:cs="Times New Roman"/>
+          <w:lang w:val="uk-UA"/>
+        </w:rPr>
+        <w:t xml:space="preserve">) − </w:t>
+      </w:r>
+      <w:proofErr w:type="spellStart"/>
+      <w:r>
+        <w:rPr>
+          <w:rFonts w:cs="Times New Roman"/>
+          <w:lang w:val="uk-UA"/>
+        </w:rPr>
+        <w:t>Med_t</w:t>
+      </w:r>
+      <w:proofErr w:type="spellEnd"/>
+      <w:r>
+        <w:rPr>
+          <w:rFonts w:cs="Times New Roman"/>
+          <w:lang w:val="uk-UA"/>
+        </w:rPr>
+        <w:t>(</w:t>
+      </w:r>
+      <w:proofErr w:type="spellStart"/>
+      <w:r>
+        <w:rPr>
+          <w:rFonts w:cs="Times New Roman"/>
+          <w:lang w:val="uk-UA"/>
+        </w:rPr>
+        <w:t>x,y</w:t>
+      </w:r>
+      <w:proofErr w:type="spellEnd"/>
+      <w:r>
+        <w:rPr>
+          <w:rFonts w:cs="Times New Roman"/>
+          <w:lang w:val="uk-UA"/>
+        </w:rPr>
+        <w:t>).</w:t>
+      </w:r>
+    </w:p>
+    <w:p>
+      <w:pPr>
+        <w:widowControl w:val="0"/>
+        <w:spacing w:after="0" w:line="240" w:lineRule="auto"/>
+        <w:rPr>
+          <w:rFonts w:cs="Times New Roman"/>
+          <w:lang w:val="uk-UA"/>
+        </w:rPr>
+      </w:pPr>
+      <w:r>
+        <w:rPr>
+          <w:rFonts w:cs="Times New Roman"/>
+          <w:b/>
+          <w:lang w:val="uk-UA"/>
+        </w:rPr>
+        <w:t>2. Вхід / вихід</w:t>
+      </w:r>
+    </w:p>
+    <w:p>
+      <w:pPr>
+        <w:widowControl w:val="0"/>
+        <w:spacing w:after="0" w:line="240" w:lineRule="auto"/>
+        <w:rPr>
+          <w:rFonts w:cs="Times New Roman"/>
+          <w:lang w:val="uk-UA"/>
+        </w:rPr>
+      </w:pPr>
+      <w:r>
+        <w:rPr>
+          <w:rFonts w:cs="Times New Roman"/>
+          <w:b/>
+          <w:lang w:val="uk-UA"/>
+        </w:rPr>
+        <w:t>2.1 Вхід</w:t>
+      </w:r>
+    </w:p>
+    <w:p>
+      <w:pPr>
+        <w:widowControl w:val="0"/>
+        <w:spacing w:after="0" w:line="240" w:lineRule="auto"/>
+        <w:rPr>
+          <w:rFonts w:cs="Times New Roman"/>
+          <w:lang w:val="uk-UA"/>
+        </w:rPr>
+      </w:pPr>
+      <w:r>
+        <w:rPr>
+          <w:rFonts w:cs="Times New Roman"/>
+          <w:lang w:val="uk-UA"/>
+        </w:rPr>
+        <w:t xml:space="preserve">• Вхідні кадри </w:t>
+      </w:r>
+      <w:proofErr w:type="spellStart"/>
+      <w:r>
+        <w:rPr>
+          <w:rFonts w:cs="Times New Roman"/>
+          <w:lang w:val="uk-UA"/>
+        </w:rPr>
+        <w:t>I_t</w:t>
+      </w:r>
+      <w:proofErr w:type="spellEnd"/>
+      <w:r>
+        <w:rPr>
+          <w:rFonts w:cs="Times New Roman"/>
+          <w:lang w:val="uk-UA"/>
+        </w:rPr>
+        <w:t xml:space="preserve"> розміру N×M, 1 канал (</w:t>
+      </w:r>
+      <w:proofErr w:type="spellStart"/>
+      <w:r>
+        <w:rPr>
+          <w:rFonts w:cs="Times New Roman"/>
+          <w:lang w:val="uk-UA"/>
+        </w:rPr>
+        <w:t>grayscale</w:t>
+      </w:r>
+      <w:proofErr w:type="spellEnd"/>
+      <w:r>
+        <w:rPr>
+          <w:rFonts w:cs="Times New Roman"/>
+          <w:lang w:val="uk-UA"/>
+        </w:rPr>
+        <w:t>).</w:t>
+      </w:r>
+    </w:p>
+    <w:p>
+      <w:pPr>
+        <w:widowControl w:val="0"/>
+        <w:spacing w:after="0" w:line="240" w:lineRule="auto"/>
+        <w:rPr>
+          <w:rFonts w:cs="Times New Roman"/>
+          <w:lang w:val="uk-UA"/>
+        </w:rPr>
+      </w:pPr>
+      <w:r>
+        <w:rPr>
+          <w:rFonts w:cs="Times New Roman"/>
+          <w:lang w:val="uk-UA"/>
+        </w:rPr>
+        <w:t>• Тип пікселя: uint8 або uint16 (обов’язково). Режим K=15–50 реалізується лише для uint8 (див. розділ 6.3).</w:t>
+      </w:r>
+    </w:p>
+    <w:p>
+      <w:pPr>
+        <w:widowControl w:val="0"/>
+        <w:spacing w:after="0" w:line="240" w:lineRule="auto"/>
+        <w:rPr>
+          <w:rFonts w:cs="Times New Roman"/>
+          <w:lang w:val="uk-UA"/>
+        </w:rPr>
+      </w:pPr>
+      <w:r>
+        <w:rPr>
+          <w:rFonts w:cs="Times New Roman"/>
+          <w:lang w:val="uk-UA"/>
+        </w:rPr>
+        <w:t>• Кадри надходять послідовно (</w:t>
+      </w:r>
+      <w:proofErr w:type="spellStart"/>
+      <w:r>
+        <w:rPr>
+          <w:rFonts w:cs="Times New Roman"/>
+          <w:lang w:val="uk-UA"/>
+        </w:rPr>
+        <w:t>streaming</w:t>
+      </w:r>
+      <w:proofErr w:type="spellEnd"/>
+      <w:r>
+        <w:rPr>
+          <w:rFonts w:cs="Times New Roman"/>
+          <w:lang w:val="uk-UA"/>
+        </w:rPr>
+        <w:t>).</w:t>
+      </w:r>
+    </w:p>
+    <w:p>
+      <w:pPr>
+        <w:widowControl w:val="0"/>
+        <w:spacing w:after="0" w:line="240" w:lineRule="auto"/>
+        <w:rPr>
+          <w:rFonts w:cs="Times New Roman"/>
+          <w:lang w:val="uk-UA"/>
+        </w:rPr>
+      </w:pPr>
+      <w:r>
+        <w:rPr>
+          <w:rFonts w:cs="Times New Roman"/>
+          <w:b/>
+          <w:lang w:val="uk-UA"/>
+        </w:rPr>
+        <w:t>2.2 Вихід</w:t>
+      </w:r>
+    </w:p>
+    <w:p>
+      <w:pPr>
+        <w:widowControl w:val="0"/>
+        <w:spacing w:after="0" w:line="240" w:lineRule="auto"/>
+        <w:rPr>
+          <w:rFonts w:cs="Times New Roman"/>
+          <w:lang w:val="uk-UA"/>
+        </w:rPr>
+      </w:pPr>
+      <w:r>
+        <w:rPr>
+          <w:rFonts w:cs="Times New Roman"/>
+          <w:lang w:val="uk-UA"/>
+        </w:rPr>
+        <w:t xml:space="preserve">• </w:t>
+      </w:r>
+      <w:proofErr w:type="spellStart"/>
+      <w:r>
+        <w:rPr>
+          <w:rFonts w:cs="Times New Roman"/>
+          <w:lang w:val="uk-UA"/>
+        </w:rPr>
+        <w:t>Med_t</w:t>
+      </w:r>
+      <w:proofErr w:type="spellEnd"/>
+      <w:r>
+        <w:rPr>
+          <w:rFonts w:cs="Times New Roman"/>
+          <w:lang w:val="uk-UA"/>
+        </w:rPr>
+        <w:t xml:space="preserve"> (</w:t>
+      </w:r>
+      <w:proofErr w:type="spellStart"/>
+      <w:r>
+        <w:rPr>
+          <w:rFonts w:cs="Times New Roman"/>
+          <w:lang w:val="uk-UA"/>
+        </w:rPr>
+        <w:t>опційно</w:t>
+      </w:r>
+      <w:proofErr w:type="spellEnd"/>
+      <w:r>
+        <w:rPr>
+          <w:rFonts w:cs="Times New Roman"/>
+          <w:lang w:val="uk-UA"/>
+        </w:rPr>
+        <w:t xml:space="preserve">, для </w:t>
+      </w:r>
+      <w:proofErr w:type="spellStart"/>
+      <w:r>
+        <w:rPr>
+          <w:rFonts w:cs="Times New Roman"/>
+          <w:lang w:val="uk-UA"/>
+        </w:rPr>
+        <w:t>дебагу</w:t>
+      </w:r>
+      <w:proofErr w:type="spellEnd"/>
+      <w:r>
+        <w:rPr>
+          <w:rFonts w:cs="Times New Roman"/>
+          <w:lang w:val="uk-UA"/>
+        </w:rPr>
+        <w:t>/</w:t>
+      </w:r>
+      <w:proofErr w:type="spellStart"/>
+      <w:r>
+        <w:rPr>
+          <w:rFonts w:cs="Times New Roman"/>
+          <w:lang w:val="uk-UA"/>
+        </w:rPr>
+        <w:t>логів</w:t>
+      </w:r>
+      <w:proofErr w:type="spellEnd"/>
+      <w:r>
+        <w:rPr>
+          <w:rFonts w:cs="Times New Roman"/>
+          <w:lang w:val="uk-UA"/>
+        </w:rPr>
+        <w:t xml:space="preserve"> або діагностики).</w:t>
+      </w:r>
+    </w:p>
+    <w:p>
+      <w:pPr>
+        <w:widowControl w:val="0"/>
+        <w:spacing w:after="0" w:line="240" w:lineRule="auto"/>
+        <w:rPr>
+          <w:rFonts w:cs="Times New Roman"/>
+          <w:lang w:val="uk-UA"/>
+        </w:rPr>
+      </w:pPr>
+      <w:r>
+        <w:rPr>
+          <w:rFonts w:cs="Times New Roman"/>
+          <w:lang w:val="uk-UA"/>
+        </w:rPr>
+        <w:t xml:space="preserve">• </w:t>
+      </w:r>
+      <w:proofErr w:type="spellStart"/>
+      <w:r>
+        <w:rPr>
+          <w:rFonts w:cs="Times New Roman"/>
+          <w:lang w:val="uk-UA"/>
+        </w:rPr>
+        <w:t>Residual_t</w:t>
+      </w:r>
+      <w:proofErr w:type="spellEnd"/>
+      <w:r>
+        <w:rPr>
+          <w:rFonts w:cs="Times New Roman"/>
+          <w:lang w:val="uk-UA"/>
+        </w:rPr>
+        <w:t xml:space="preserve"> як знаковий кадр:</w:t>
+      </w:r>
+    </w:p>
+    <w:p>
+      <w:pPr>
+        <w:widowControl w:val="0"/>
+        <w:spacing w:after="0" w:line="240" w:lineRule="auto"/>
+        <w:rPr>
+          <w:rFonts w:cs="Times New Roman"/>
+          <w:lang w:val="uk-UA"/>
+        </w:rPr>
+      </w:pPr>
+      <w:r>
+        <w:rPr>
+          <w:rFonts w:cs="Times New Roman"/>
+          <w:lang w:val="uk-UA"/>
+        </w:rPr>
+        <w:t xml:space="preserve">   – для uint8 → int16;   – для uint16 → int32.</w:t>
+      </w:r>
+    </w:p>
+    <w:p>
+      <w:pPr>
+        <w:widowControl w:val="0"/>
+        <w:spacing w:after="0" w:line="240" w:lineRule="auto"/>
+        <w:rPr>
+          <w:rFonts w:cs="Times New Roman"/>
+          <w:lang w:val="uk-UA"/>
+        </w:rPr>
+      </w:pPr>
+      <w:r>
+        <w:rPr>
+          <w:rFonts w:cs="Times New Roman"/>
+          <w:b/>
+          <w:lang w:val="uk-UA"/>
+        </w:rPr>
+        <w:t>3. Режими роботи</w:t>
+      </w:r>
+    </w:p>
+    <w:p>
+      <w:pPr>
+        <w:widowControl w:val="0"/>
+        <w:spacing w:after="0" w:line="240" w:lineRule="auto"/>
+        <w:rPr>
+          <w:rFonts w:cs="Times New Roman"/>
+          <w:lang w:val="uk-UA"/>
+        </w:rPr>
+      </w:pPr>
+      <w:r>
+        <w:rPr>
+          <w:rFonts w:cs="Times New Roman"/>
+          <w:lang w:val="uk-UA"/>
+        </w:rPr>
+        <w:t>Підтримати 3 режими:</w:t>
+      </w:r>
+    </w:p>
+    <w:p>
+      <w:pPr>
+        <w:widowControl w:val="0"/>
+        <w:spacing w:after="0" w:line="240" w:lineRule="auto"/>
+        <w:rPr>
+          <w:rFonts w:cs="Times New Roman"/>
+          <w:lang w:val="uk-UA"/>
+        </w:rPr>
+      </w:pPr>
+      <w:r>
+        <w:rPr>
+          <w:rFonts w:cs="Times New Roman"/>
+          <w:lang w:val="uk-UA"/>
+        </w:rPr>
+        <w:t>A) FixedK3: точна медіана за 3 кадрами (K=3).</w:t>
+      </w:r>
+    </w:p>
+    <w:p>
+      <w:pPr>
+        <w:widowControl w:val="0"/>
+        <w:spacing w:after="0" w:line="240" w:lineRule="auto"/>
+        <w:rPr>
+          <w:rFonts w:cs="Times New Roman"/>
+          <w:lang w:val="uk-UA"/>
+        </w:rPr>
+      </w:pPr>
+      <w:r>
+        <w:rPr>
+          <w:rFonts w:cs="Times New Roman"/>
+          <w:lang w:val="uk-UA"/>
+        </w:rPr>
+        <w:t>B) FixedK5: точна медіана за 5 кадрами (K=5).</w:t>
+      </w:r>
+    </w:p>
+    <w:p>
+      <w:pPr>
+        <w:widowControl w:val="0"/>
+        <w:spacing w:after="0" w:line="240" w:lineRule="auto"/>
+        <w:rPr>
+          <w:rFonts w:cs="Times New Roman"/>
+          <w:lang w:val="uk-UA"/>
+        </w:rPr>
+      </w:pPr>
+      <w:r>
+        <w:rPr>
+          <w:rFonts w:cs="Times New Roman"/>
+          <w:lang w:val="uk-UA"/>
+        </w:rPr>
+        <w:t>C) ArbitraryK8bit: точна медіана за довільним K у діапазоні 15–50, лише для uint8, зі зберіганням усіх K кадрів у кільцевому буфері.</w:t>
+      </w:r>
+    </w:p>
+    <w:p>
+      <w:pPr>
+        <w:widowControl w:val="0"/>
+        <w:spacing w:after="0" w:line="240" w:lineRule="auto"/>
+        <w:rPr>
+          <w:rFonts w:cs="Times New Roman"/>
+          <w:lang w:val="uk-UA"/>
+        </w:rPr>
+      </w:pPr>
+      <w:r>
+        <w:rPr>
+          <w:rFonts w:cs="Times New Roman"/>
+          <w:b/>
+          <w:lang w:val="uk-UA"/>
+        </w:rPr>
+        <w:t>4. Параметри (</w:t>
+      </w:r>
+      <w:proofErr w:type="spellStart"/>
+      <w:r>
+        <w:rPr>
+          <w:rFonts w:cs="Times New Roman"/>
+          <w:b/>
+          <w:lang w:val="uk-UA"/>
+        </w:rPr>
+        <w:t>конфіг</w:t>
+      </w:r>
+      <w:proofErr w:type="spellEnd"/>
+      <w:r>
+        <w:rPr>
+          <w:rFonts w:cs="Times New Roman"/>
+          <w:b/>
+          <w:lang w:val="uk-UA"/>
+        </w:rPr>
+        <w:t>)</w:t>
+      </w:r>
+    </w:p>
+    <w:p>
+      <w:pPr>
+        <w:widowControl w:val="0"/>
+        <w:spacing w:after="0" w:line="240" w:lineRule="auto"/>
+        <w:rPr>
+          <w:rFonts w:cs="Times New Roman"/>
+          <w:lang w:val="uk-UA"/>
+        </w:rPr>
+      </w:pPr>
+      <w:r>
+        <w:rPr>
+          <w:rFonts w:cs="Times New Roman"/>
+          <w:b/>
+          <w:lang w:val="uk-UA"/>
+        </w:rPr>
+        <w:t>4.1 Основні параметри</w:t>
+      </w:r>
+    </w:p>
+    <w:p>
+      <w:pPr>
+        <w:widowControl w:val="0"/>
+        <w:spacing w:after="0" w:line="240" w:lineRule="auto"/>
+        <w:rPr>
+          <w:rFonts w:cs="Times New Roman"/>
+          <w:lang w:val="uk-UA"/>
+        </w:rPr>
+      </w:pPr>
+      <w:r>
+        <w:rPr>
+          <w:rFonts w:cs="Times New Roman"/>
+          <w:lang w:val="uk-UA"/>
+        </w:rPr>
+        <w:t xml:space="preserve">• </w:t>
+      </w:r>
+      <w:proofErr w:type="spellStart"/>
+      <w:r>
+        <w:rPr>
+          <w:rFonts w:cs="Times New Roman"/>
+          <w:lang w:val="uk-UA"/>
+        </w:rPr>
+        <w:t>mode</w:t>
+      </w:r>
+      <w:proofErr w:type="spellEnd"/>
+      <w:r>
+        <w:rPr>
+          <w:rFonts w:cs="Times New Roman"/>
+          <w:lang w:val="uk-UA"/>
+        </w:rPr>
+        <w:t xml:space="preserve"> </w:t>
+      </w:r>
+      <w:r>
+        <w:rPr>
+          <w:rFonts w:ascii="Cambria Math" w:hAnsi="Cambria Math" w:cs="Cambria Math"/>
+          <w:lang w:val="uk-UA"/>
+        </w:rPr>
+        <w:t>∈</w:t>
+      </w:r>
+      <w:r>
+        <w:rPr>
+          <w:rFonts w:cs="Times New Roman"/>
+          <w:lang w:val="uk-UA"/>
+        </w:rPr>
+        <w:t xml:space="preserve"> {FixedK3, FixedK5, ArbitraryK8bit}.</w:t>
+      </w:r>
+    </w:p>
+    <w:p>
+      <w:pPr>
+        <w:widowControl w:val="0"/>
+        <w:spacing w:after="0" w:line="240" w:lineRule="auto"/>
+        <w:rPr>
+          <w:rFonts w:cs="Times New Roman"/>
+          <w:lang w:val="uk-UA"/>
+        </w:rPr>
+      </w:pPr>
+      <w:r>
+        <w:rPr>
+          <w:rFonts w:cs="Times New Roman"/>
+          <w:lang w:val="uk-UA"/>
+        </w:rPr>
+        <w:t xml:space="preserve">• </w:t>
+      </w:r>
+      <w:proofErr w:type="spellStart"/>
+      <w:r>
+        <w:rPr>
+          <w:rFonts w:cs="Times New Roman"/>
+          <w:lang w:val="uk-UA"/>
+        </w:rPr>
+        <w:t>stride</w:t>
+      </w:r>
+      <w:proofErr w:type="spellEnd"/>
+      <w:r>
+        <w:rPr>
+          <w:rFonts w:cs="Times New Roman"/>
+          <w:lang w:val="uk-UA"/>
+        </w:rPr>
+        <w:t xml:space="preserve"> ≥ 1 — крок відбору кадрів у буфер медіани:</w:t>
+      </w:r>
+    </w:p>
+    <w:p>
+      <w:pPr>
+        <w:widowControl w:val="0"/>
+        <w:spacing w:after="0" w:line="240" w:lineRule="auto"/>
+        <w:rPr>
+          <w:rFonts w:cs="Times New Roman"/>
+          <w:lang w:val="uk-UA"/>
+        </w:rPr>
+      </w:pPr>
+      <w:r>
+        <w:rPr>
+          <w:rFonts w:cs="Times New Roman"/>
+          <w:lang w:val="uk-UA"/>
+        </w:rPr>
+        <w:t xml:space="preserve">   </w:t>
+      </w:r>
+      <w:proofErr w:type="spellStart"/>
+      <w:r>
+        <w:rPr>
+          <w:rFonts w:cs="Times New Roman"/>
+          <w:lang w:val="uk-UA"/>
+        </w:rPr>
+        <w:t>stride</w:t>
+      </w:r>
+      <w:proofErr w:type="spellEnd"/>
+      <w:r>
+        <w:rPr>
+          <w:rFonts w:cs="Times New Roman"/>
+          <w:lang w:val="uk-UA"/>
+        </w:rPr>
+        <w:t xml:space="preserve">=1 → кожний кадр; </w:t>
+      </w:r>
+      <w:proofErr w:type="spellStart"/>
+      <w:r>
+        <w:rPr>
+          <w:rFonts w:cs="Times New Roman"/>
+          <w:lang w:val="uk-UA"/>
+        </w:rPr>
+        <w:t>stride</w:t>
+      </w:r>
+      <w:proofErr w:type="spellEnd"/>
+      <w:r>
+        <w:rPr>
+          <w:rFonts w:cs="Times New Roman"/>
+          <w:lang w:val="uk-UA"/>
+        </w:rPr>
+        <w:t xml:space="preserve">=2 → через 1; </w:t>
+      </w:r>
+      <w:proofErr w:type="spellStart"/>
+      <w:r>
+        <w:rPr>
+          <w:rFonts w:cs="Times New Roman"/>
+          <w:lang w:val="uk-UA"/>
+        </w:rPr>
+        <w:t>stride</w:t>
+      </w:r>
+      <w:proofErr w:type="spellEnd"/>
+      <w:r>
+        <w:rPr>
+          <w:rFonts w:cs="Times New Roman"/>
+          <w:lang w:val="uk-UA"/>
+        </w:rPr>
+        <w:t xml:space="preserve">=3 → через 2; загально — беремо кожний </w:t>
+      </w:r>
+      <w:proofErr w:type="spellStart"/>
+      <w:r>
+        <w:rPr>
+          <w:rFonts w:cs="Times New Roman"/>
+          <w:lang w:val="uk-UA"/>
+        </w:rPr>
+        <w:t>stride</w:t>
+      </w:r>
+      <w:proofErr w:type="spellEnd"/>
+      <w:r>
+        <w:rPr>
+          <w:rFonts w:cs="Times New Roman"/>
+          <w:lang w:val="uk-UA"/>
+        </w:rPr>
+        <w:t>-й кадр.</w:t>
+      </w:r>
+    </w:p>
+    <w:p>
+      <w:pPr>
+        <w:widowControl w:val="0"/>
+        <w:spacing w:after="0" w:line="240" w:lineRule="auto"/>
+        <w:rPr>
+          <w:rFonts w:cs="Times New Roman"/>
+          <w:lang w:val="uk-UA"/>
+        </w:rPr>
+      </w:pPr>
+      <w:r>
+        <w:rPr>
+          <w:rFonts w:cs="Times New Roman"/>
+          <w:lang w:val="uk-UA"/>
+        </w:rPr>
+        <w:t xml:space="preserve">• </w:t>
+      </w:r>
+      <w:proofErr w:type="spellStart"/>
+      <w:r>
+        <w:rPr>
+          <w:rFonts w:cs="Times New Roman"/>
+          <w:lang w:val="uk-UA"/>
+        </w:rPr>
+        <w:t>K_arbitrary</w:t>
+      </w:r>
+      <w:proofErr w:type="spellEnd"/>
+      <w:r>
+        <w:rPr>
+          <w:rFonts w:cs="Times New Roman"/>
+          <w:lang w:val="uk-UA"/>
+        </w:rPr>
+        <w:t xml:space="preserve"> — використовується лише в режимі ArbitraryK8bit: 15 ≤ </w:t>
+      </w:r>
+      <w:proofErr w:type="spellStart"/>
+      <w:r>
+        <w:rPr>
+          <w:rFonts w:cs="Times New Roman"/>
+          <w:lang w:val="uk-UA"/>
+        </w:rPr>
+        <w:t>K_arbitrary</w:t>
+      </w:r>
+      <w:proofErr w:type="spellEnd"/>
+      <w:r>
+        <w:rPr>
+          <w:rFonts w:cs="Times New Roman"/>
+          <w:lang w:val="uk-UA"/>
+        </w:rPr>
+        <w:t xml:space="preserve"> ≤ 50.</w:t>
+      </w:r>
+    </w:p>
+    <w:p>
+      <w:pPr>
+        <w:widowControl w:val="0"/>
+        <w:spacing w:after="0" w:line="240" w:lineRule="auto"/>
+        <w:rPr>
+          <w:rFonts w:cs="Times New Roman"/>
+          <w:lang w:val="uk-UA"/>
+        </w:rPr>
+      </w:pPr>
+      <w:r>
+        <w:rPr>
+          <w:rFonts w:cs="Times New Roman"/>
+          <w:b/>
+          <w:lang w:val="uk-UA"/>
+        </w:rPr>
+        <w:t>4.2 Режим часової симетрії</w:t>
+      </w:r>
+    </w:p>
+    <w:p>
+      <w:pPr>
+        <w:widowControl w:val="0"/>
+        <w:spacing w:after="0" w:line="240" w:lineRule="auto"/>
+        <w:rPr>
+          <w:rFonts w:cs="Times New Roman"/>
+          <w:lang w:val="uk-UA"/>
+        </w:rPr>
+      </w:pPr>
+      <w:proofErr w:type="spellStart"/>
+      <w:r>
+        <w:rPr>
+          <w:rFonts w:cs="Times New Roman"/>
+          <w:lang w:val="uk-UA"/>
+        </w:rPr>
+        <w:t>temporal_mode</w:t>
+      </w:r>
+      <w:proofErr w:type="spellEnd"/>
+      <w:r>
+        <w:rPr>
+          <w:rFonts w:cs="Times New Roman"/>
+          <w:lang w:val="uk-UA"/>
+        </w:rPr>
+        <w:t>:</w:t>
+      </w:r>
+    </w:p>
+    <w:p>
+      <w:pPr>
+        <w:widowControl w:val="0"/>
+        <w:spacing w:after="0" w:line="240" w:lineRule="auto"/>
         <w:rPr>
           <w:rFonts w:cs="Times New Roman"/>
           <w:b/>
@@ -140,923 +1054,8 @@
           <w:u w:val="single"/>
           <w:lang w:val="uk-UA"/>
         </w:rPr>
-        <w:t xml:space="preserve"> поки можна не реалізовувати</w:t>
-      </w:r>
-    </w:p>
-    <w:p>
-      <w:pPr>
-        <w:widowControl w:val="0"/>
-        <w:spacing w:after="0" w:line="240" w:lineRule="auto"/>
-        <w:jc w:val="center"/>
-        <w:rPr>
-          <w:rFonts w:cs="Times New Roman"/>
-          <w:lang w:val="uk-UA"/>
-        </w:rPr>
-      </w:pPr>
-    </w:p>
-    <w:p>
-      <w:pPr>
-        <w:widowControl w:val="0"/>
-        <w:spacing w:after="0" w:line="240" w:lineRule="auto"/>
-        <w:rPr>
-          <w:rFonts w:cs="Times New Roman"/>
-          <w:lang w:val="uk-UA"/>
-        </w:rPr>
-      </w:pPr>
-      <w:r>
-        <w:rPr>
-          <w:rFonts w:cs="Times New Roman"/>
-          <w:b/>
-          <w:lang w:val="uk-UA"/>
-        </w:rPr>
-        <w:t>1. Призначення</w:t>
-      </w:r>
-    </w:p>
-    <w:p>
-      <w:pPr>
-        <w:widowControl w:val="0"/>
-        <w:spacing w:after="0" w:line="240" w:lineRule="auto"/>
-        <w:rPr>
-          <w:rFonts w:cs="Times New Roman"/>
-          <w:lang w:val="uk-UA"/>
-        </w:rPr>
-      </w:pPr>
-      <w:r>
-        <w:rPr>
-          <w:rFonts w:cs="Times New Roman"/>
-          <w:lang w:val="uk-UA"/>
-        </w:rPr>
-        <w:t xml:space="preserve">Реалізувати модуль, який для </w:t>
-      </w:r>
-      <w:proofErr w:type="spellStart"/>
-      <w:r>
-        <w:rPr>
-          <w:rFonts w:cs="Times New Roman"/>
-          <w:lang w:val="uk-UA"/>
-        </w:rPr>
-        <w:t>відеопотоку</w:t>
-      </w:r>
-      <w:proofErr w:type="spellEnd"/>
-      <w:r>
-        <w:rPr>
-          <w:rFonts w:cs="Times New Roman"/>
-          <w:lang w:val="uk-UA"/>
-        </w:rPr>
-        <w:t xml:space="preserve"> обчислює </w:t>
-      </w:r>
-      <w:proofErr w:type="spellStart"/>
-      <w:r>
-        <w:rPr>
-          <w:rFonts w:cs="Times New Roman"/>
-          <w:lang w:val="uk-UA"/>
-        </w:rPr>
-        <w:t>міжкадрову</w:t>
-      </w:r>
-      <w:proofErr w:type="spellEnd"/>
-      <w:r>
-        <w:rPr>
-          <w:rFonts w:cs="Times New Roman"/>
-          <w:lang w:val="uk-UA"/>
-        </w:rPr>
-        <w:t xml:space="preserve"> </w:t>
-      </w:r>
-      <w:proofErr w:type="spellStart"/>
-      <w:r>
-        <w:rPr>
-          <w:rFonts w:cs="Times New Roman"/>
-          <w:lang w:val="uk-UA"/>
-        </w:rPr>
-        <w:t>попіксельну</w:t>
-      </w:r>
-      <w:proofErr w:type="spellEnd"/>
-      <w:r>
-        <w:rPr>
-          <w:rFonts w:cs="Times New Roman"/>
-          <w:lang w:val="uk-UA"/>
-        </w:rPr>
-        <w:t xml:space="preserve"> медіану (лише по часу, без просторового вікна) та формує різницевий кадр (</w:t>
-      </w:r>
-      <w:proofErr w:type="spellStart"/>
-      <w:r>
-        <w:rPr>
-          <w:rFonts w:cs="Times New Roman"/>
-          <w:lang w:val="uk-UA"/>
-        </w:rPr>
-        <w:t>residual</w:t>
-      </w:r>
-      <w:proofErr w:type="spellEnd"/>
-      <w:r>
-        <w:rPr>
-          <w:rFonts w:cs="Times New Roman"/>
-          <w:lang w:val="uk-UA"/>
-        </w:rPr>
-        <w:t xml:space="preserve">) для подальшої обробки в </w:t>
-      </w:r>
-      <w:proofErr w:type="spellStart"/>
-      <w:r>
-        <w:rPr>
-          <w:rFonts w:cs="Times New Roman"/>
-          <w:lang w:val="uk-UA"/>
-        </w:rPr>
-        <w:t>pipeline</w:t>
-      </w:r>
-      <w:proofErr w:type="spellEnd"/>
-      <w:r>
-        <w:rPr>
-          <w:rFonts w:cs="Times New Roman"/>
-          <w:lang w:val="uk-UA"/>
-        </w:rPr>
-        <w:t>:</w:t>
-      </w:r>
-    </w:p>
-    <w:p>
-      <w:pPr>
-        <w:widowControl w:val="0"/>
-        <w:spacing w:after="0" w:line="240" w:lineRule="auto"/>
-        <w:rPr>
-          <w:rFonts w:cs="Times New Roman"/>
-          <w:lang w:val="uk-UA"/>
-        </w:rPr>
-      </w:pPr>
-      <w:proofErr w:type="spellStart"/>
-      <w:r>
-        <w:rPr>
-          <w:rFonts w:cs="Times New Roman"/>
-          <w:lang w:val="uk-UA"/>
-        </w:rPr>
-        <w:t>R_t</w:t>
-      </w:r>
-      <w:proofErr w:type="spellEnd"/>
-      <w:r>
-        <w:rPr>
-          <w:rFonts w:cs="Times New Roman"/>
-          <w:lang w:val="uk-UA"/>
-        </w:rPr>
-        <w:t>(</w:t>
-      </w:r>
-      <w:proofErr w:type="spellStart"/>
-      <w:r>
-        <w:rPr>
-          <w:rFonts w:cs="Times New Roman"/>
-          <w:lang w:val="uk-UA"/>
-        </w:rPr>
-        <w:t>x,y</w:t>
-      </w:r>
-      <w:proofErr w:type="spellEnd"/>
-      <w:r>
-        <w:rPr>
-          <w:rFonts w:cs="Times New Roman"/>
-          <w:lang w:val="uk-UA"/>
-        </w:rPr>
-        <w:t xml:space="preserve">) = </w:t>
-      </w:r>
-      <w:proofErr w:type="spellStart"/>
-      <w:r>
-        <w:rPr>
-          <w:rFonts w:cs="Times New Roman"/>
-          <w:lang w:val="uk-UA"/>
-        </w:rPr>
-        <w:t>I_t</w:t>
-      </w:r>
-      <w:proofErr w:type="spellEnd"/>
-      <w:r>
-        <w:rPr>
-          <w:rFonts w:cs="Times New Roman"/>
-          <w:lang w:val="uk-UA"/>
-        </w:rPr>
-        <w:t>(</w:t>
-      </w:r>
-      <w:proofErr w:type="spellStart"/>
-      <w:r>
-        <w:rPr>
-          <w:rFonts w:cs="Times New Roman"/>
-          <w:lang w:val="uk-UA"/>
-        </w:rPr>
-        <w:t>x,y</w:t>
-      </w:r>
-      <w:proofErr w:type="spellEnd"/>
-      <w:r>
-        <w:rPr>
-          <w:rFonts w:cs="Times New Roman"/>
-          <w:lang w:val="uk-UA"/>
-        </w:rPr>
-        <w:t xml:space="preserve">) − </w:t>
-      </w:r>
-      <w:proofErr w:type="spellStart"/>
-      <w:r>
-        <w:rPr>
-          <w:rFonts w:cs="Times New Roman"/>
-          <w:lang w:val="uk-UA"/>
-        </w:rPr>
-        <w:t>Med_t</w:t>
-      </w:r>
-      <w:proofErr w:type="spellEnd"/>
-      <w:r>
-        <w:rPr>
-          <w:rFonts w:cs="Times New Roman"/>
-          <w:lang w:val="uk-UA"/>
-        </w:rPr>
-        <w:t>(</w:t>
-      </w:r>
-      <w:proofErr w:type="spellStart"/>
-      <w:r>
-        <w:rPr>
-          <w:rFonts w:cs="Times New Roman"/>
-          <w:lang w:val="uk-UA"/>
-        </w:rPr>
-        <w:t>x,y</w:t>
-      </w:r>
-      <w:proofErr w:type="spellEnd"/>
-      <w:r>
-        <w:rPr>
-          <w:rFonts w:cs="Times New Roman"/>
-          <w:lang w:val="uk-UA"/>
-        </w:rPr>
-        <w:t>).</w:t>
-      </w:r>
-    </w:p>
-    <w:p>
-      <w:pPr>
-        <w:widowControl w:val="0"/>
-        <w:spacing w:after="0" w:line="240" w:lineRule="auto"/>
-        <w:rPr>
-          <w:rFonts w:cs="Times New Roman"/>
-          <w:lang w:val="uk-UA"/>
-        </w:rPr>
-      </w:pPr>
-      <w:r>
-        <w:rPr>
-          <w:rFonts w:cs="Times New Roman"/>
-          <w:b/>
-          <w:lang w:val="uk-UA"/>
-        </w:rPr>
-        <w:t>2. Вхід / вихід</w:t>
-      </w:r>
-    </w:p>
-    <w:p>
-      <w:pPr>
-        <w:widowControl w:val="0"/>
-        <w:spacing w:after="0" w:line="240" w:lineRule="auto"/>
-        <w:rPr>
-          <w:rFonts w:cs="Times New Roman"/>
-          <w:lang w:val="uk-UA"/>
-        </w:rPr>
-      </w:pPr>
-      <w:r>
-        <w:rPr>
-          <w:rFonts w:cs="Times New Roman"/>
-          <w:b/>
-          <w:lang w:val="uk-UA"/>
-        </w:rPr>
-        <w:t>2.1 Вхід</w:t>
-      </w:r>
-    </w:p>
-    <w:p>
-      <w:pPr>
-        <w:widowControl w:val="0"/>
-        <w:spacing w:after="0" w:line="240" w:lineRule="auto"/>
-        <w:rPr>
-          <w:rFonts w:cs="Times New Roman"/>
-          <w:lang w:val="uk-UA"/>
-        </w:rPr>
-      </w:pPr>
-      <w:r>
-        <w:rPr>
-          <w:rFonts w:cs="Times New Roman"/>
-          <w:lang w:val="uk-UA"/>
-        </w:rPr>
-        <w:t xml:space="preserve">• Вхідні кадри </w:t>
-      </w:r>
-      <w:proofErr w:type="spellStart"/>
-      <w:r>
-        <w:rPr>
-          <w:rFonts w:cs="Times New Roman"/>
-          <w:lang w:val="uk-UA"/>
-        </w:rPr>
-        <w:t>I_t</w:t>
-      </w:r>
-      <w:proofErr w:type="spellEnd"/>
-      <w:r>
-        <w:rPr>
-          <w:rFonts w:cs="Times New Roman"/>
-          <w:lang w:val="uk-UA"/>
-        </w:rPr>
-        <w:t xml:space="preserve"> розміру N×M, 1 канал (</w:t>
-      </w:r>
-      <w:proofErr w:type="spellStart"/>
-      <w:r>
-        <w:rPr>
-          <w:rFonts w:cs="Times New Roman"/>
-          <w:lang w:val="uk-UA"/>
-        </w:rPr>
-        <w:t>grayscale</w:t>
-      </w:r>
-      <w:proofErr w:type="spellEnd"/>
-      <w:r>
-        <w:rPr>
-          <w:rFonts w:cs="Times New Roman"/>
-          <w:lang w:val="uk-UA"/>
-        </w:rPr>
-        <w:t>).</w:t>
-      </w:r>
-    </w:p>
-    <w:p>
-      <w:pPr>
-        <w:widowControl w:val="0"/>
-        <w:spacing w:after="0" w:line="240" w:lineRule="auto"/>
-        <w:rPr>
-          <w:rFonts w:cs="Times New Roman"/>
-          <w:lang w:val="uk-UA"/>
-        </w:rPr>
-      </w:pPr>
-      <w:r>
-        <w:rPr>
-          <w:rFonts w:cs="Times New Roman"/>
-          <w:lang w:val="uk-UA"/>
-        </w:rPr>
-        <w:t>• Тип пікселя: uint8 або uint16 (обов’язково). Режим K=15–50 реалізується лише для uint8 (див. розділ 6.3).</w:t>
-      </w:r>
-    </w:p>
-    <w:p>
-      <w:pPr>
-        <w:widowControl w:val="0"/>
-        <w:spacing w:after="0" w:line="240" w:lineRule="auto"/>
-        <w:rPr>
-          <w:rFonts w:cs="Times New Roman"/>
-          <w:lang w:val="uk-UA"/>
-        </w:rPr>
-      </w:pPr>
-      <w:r>
-        <w:rPr>
-          <w:rFonts w:cs="Times New Roman"/>
-          <w:lang w:val="uk-UA"/>
-        </w:rPr>
-        <w:t>• Кадри надходять послідовно (</w:t>
-      </w:r>
-      <w:proofErr w:type="spellStart"/>
-      <w:r>
-        <w:rPr>
-          <w:rFonts w:cs="Times New Roman"/>
-          <w:lang w:val="uk-UA"/>
-        </w:rPr>
-        <w:t>streaming</w:t>
-      </w:r>
-      <w:proofErr w:type="spellEnd"/>
-      <w:r>
-        <w:rPr>
-          <w:rFonts w:cs="Times New Roman"/>
-          <w:lang w:val="uk-UA"/>
-        </w:rPr>
-        <w:t>).</w:t>
-      </w:r>
-    </w:p>
-    <w:p>
-      <w:pPr>
-        <w:widowControl w:val="0"/>
-        <w:spacing w:after="0" w:line="240" w:lineRule="auto"/>
-        <w:rPr>
-          <w:rFonts w:cs="Times New Roman"/>
-          <w:lang w:val="uk-UA"/>
-        </w:rPr>
-      </w:pPr>
-      <w:r>
-        <w:rPr>
-          <w:rFonts w:cs="Times New Roman"/>
-          <w:b/>
-          <w:lang w:val="uk-UA"/>
-        </w:rPr>
-        <w:t>2.2 Вихід</w:t>
-      </w:r>
-    </w:p>
-    <w:p>
-      <w:pPr>
-        <w:widowControl w:val="0"/>
-        <w:spacing w:after="0" w:line="240" w:lineRule="auto"/>
-        <w:rPr>
-          <w:rFonts w:cs="Times New Roman"/>
-          <w:lang w:val="uk-UA"/>
-        </w:rPr>
-      </w:pPr>
-      <w:r>
-        <w:rPr>
-          <w:rFonts w:cs="Times New Roman"/>
-          <w:lang w:val="uk-UA"/>
-        </w:rPr>
-        <w:t xml:space="preserve">• </w:t>
-      </w:r>
-      <w:proofErr w:type="spellStart"/>
-      <w:r>
-        <w:rPr>
-          <w:rFonts w:cs="Times New Roman"/>
-          <w:lang w:val="uk-UA"/>
-        </w:rPr>
-        <w:t>Med_t</w:t>
-      </w:r>
-      <w:proofErr w:type="spellEnd"/>
-      <w:r>
-        <w:rPr>
-          <w:rFonts w:cs="Times New Roman"/>
-          <w:lang w:val="uk-UA"/>
-        </w:rPr>
-        <w:t xml:space="preserve"> (</w:t>
-      </w:r>
-      <w:proofErr w:type="spellStart"/>
-      <w:r>
-        <w:rPr>
-          <w:rFonts w:cs="Times New Roman"/>
-          <w:lang w:val="uk-UA"/>
-        </w:rPr>
-        <w:t>опційно</w:t>
-      </w:r>
-      <w:proofErr w:type="spellEnd"/>
-      <w:r>
-        <w:rPr>
-          <w:rFonts w:cs="Times New Roman"/>
-          <w:lang w:val="uk-UA"/>
-        </w:rPr>
-        <w:t xml:space="preserve">, для </w:t>
-      </w:r>
-      <w:proofErr w:type="spellStart"/>
-      <w:r>
-        <w:rPr>
-          <w:rFonts w:cs="Times New Roman"/>
-          <w:lang w:val="uk-UA"/>
-        </w:rPr>
-        <w:t>дебагу</w:t>
-      </w:r>
-      <w:proofErr w:type="spellEnd"/>
-      <w:r>
-        <w:rPr>
-          <w:rFonts w:cs="Times New Roman"/>
-          <w:lang w:val="uk-UA"/>
-        </w:rPr>
-        <w:t>/</w:t>
-      </w:r>
-      <w:proofErr w:type="spellStart"/>
-      <w:r>
-        <w:rPr>
-          <w:rFonts w:cs="Times New Roman"/>
-          <w:lang w:val="uk-UA"/>
-        </w:rPr>
-        <w:t>логів</w:t>
-      </w:r>
-      <w:proofErr w:type="spellEnd"/>
-      <w:r>
-        <w:rPr>
-          <w:rFonts w:cs="Times New Roman"/>
-          <w:lang w:val="uk-UA"/>
-        </w:rPr>
-        <w:t xml:space="preserve"> або діагностики).</w:t>
-      </w:r>
-    </w:p>
-    <w:p>
-      <w:pPr>
-        <w:widowControl w:val="0"/>
-        <w:spacing w:after="0" w:line="240" w:lineRule="auto"/>
-        <w:rPr>
-          <w:rFonts w:cs="Times New Roman"/>
-          <w:lang w:val="uk-UA"/>
-        </w:rPr>
-      </w:pPr>
-      <w:r>
-        <w:rPr>
-          <w:rFonts w:cs="Times New Roman"/>
-          <w:lang w:val="uk-UA"/>
-        </w:rPr>
-        <w:t xml:space="preserve">• </w:t>
-      </w:r>
-      <w:proofErr w:type="spellStart"/>
-      <w:r>
-        <w:rPr>
-          <w:rFonts w:cs="Times New Roman"/>
-          <w:lang w:val="uk-UA"/>
-        </w:rPr>
-        <w:t>Residual_t</w:t>
-      </w:r>
-      <w:proofErr w:type="spellEnd"/>
-      <w:r>
-        <w:rPr>
-          <w:rFonts w:cs="Times New Roman"/>
-          <w:lang w:val="uk-UA"/>
-        </w:rPr>
-        <w:t xml:space="preserve"> як знаковий кадр:</w:t>
-      </w:r>
-    </w:p>
-    <w:p>
-      <w:pPr>
-        <w:widowControl w:val="0"/>
-        <w:spacing w:after="0" w:line="240" w:lineRule="auto"/>
-        <w:rPr>
-          <w:rFonts w:cs="Times New Roman"/>
-          <w:lang w:val="uk-UA"/>
-        </w:rPr>
-      </w:pPr>
-      <w:r>
-        <w:rPr>
-          <w:rFonts w:cs="Times New Roman"/>
-          <w:lang w:val="uk-UA"/>
-        </w:rPr>
-        <w:t xml:space="preserve">   – для uint8 → int16;   – для uint16 → int32.</w:t>
-      </w:r>
-    </w:p>
-    <w:p>
-      <w:pPr>
-        <w:widowControl w:val="0"/>
-        <w:spacing w:after="0" w:line="240" w:lineRule="auto"/>
-        <w:rPr>
-          <w:rFonts w:cs="Times New Roman"/>
-          <w:lang w:val="uk-UA"/>
-        </w:rPr>
-      </w:pPr>
-      <w:r>
-        <w:rPr>
-          <w:rFonts w:cs="Times New Roman"/>
-          <w:b/>
-          <w:lang w:val="uk-UA"/>
-        </w:rPr>
-        <w:t>3. Режими роботи</w:t>
-      </w:r>
-    </w:p>
-    <w:p>
-      <w:pPr>
-        <w:widowControl w:val="0"/>
-        <w:spacing w:after="0" w:line="240" w:lineRule="auto"/>
-        <w:rPr>
-          <w:rFonts w:cs="Times New Roman"/>
-          <w:lang w:val="uk-UA"/>
-        </w:rPr>
-      </w:pPr>
-      <w:r>
-        <w:rPr>
-          <w:rFonts w:cs="Times New Roman"/>
-          <w:lang w:val="uk-UA"/>
-        </w:rPr>
-        <w:t>Підтримати 3 режими:</w:t>
-      </w:r>
-    </w:p>
-    <w:p>
-      <w:pPr>
-        <w:widowControl w:val="0"/>
-        <w:spacing w:after="0" w:line="240" w:lineRule="auto"/>
-        <w:rPr>
-          <w:rFonts w:cs="Times New Roman"/>
-          <w:lang w:val="uk-UA"/>
-        </w:rPr>
-      </w:pPr>
-      <w:r>
-        <w:rPr>
-          <w:rFonts w:cs="Times New Roman"/>
-          <w:lang w:val="uk-UA"/>
-        </w:rPr>
-        <w:t>A) FixedK3: точна медіана за 3 кадрами (K=3).</w:t>
-      </w:r>
-    </w:p>
-    <w:p>
-      <w:pPr>
-        <w:widowControl w:val="0"/>
-        <w:spacing w:after="0" w:line="240" w:lineRule="auto"/>
-        <w:rPr>
-          <w:rFonts w:cs="Times New Roman"/>
-          <w:lang w:val="uk-UA"/>
-        </w:rPr>
-      </w:pPr>
-      <w:r>
-        <w:rPr>
-          <w:rFonts w:cs="Times New Roman"/>
-          <w:lang w:val="uk-UA"/>
-        </w:rPr>
-        <w:t>B) FixedK5: точна медіана за 5 кадрами (K=5).</w:t>
-      </w:r>
-    </w:p>
-    <w:p>
-      <w:pPr>
-        <w:widowControl w:val="0"/>
-        <w:spacing w:after="0" w:line="240" w:lineRule="auto"/>
-        <w:rPr>
-          <w:rFonts w:cs="Times New Roman"/>
-          <w:lang w:val="uk-UA"/>
-        </w:rPr>
-      </w:pPr>
-      <w:r>
-        <w:rPr>
-          <w:rFonts w:cs="Times New Roman"/>
-          <w:lang w:val="uk-UA"/>
-        </w:rPr>
-        <w:t>C) ArbitraryK8bit: точна медіана за довільним K у діапазоні 15–50, лише для uint8, зі зберіганням усіх K кадрів у кільцевому буфері.</w:t>
-      </w:r>
-    </w:p>
-    <w:p>
-      <w:pPr>
-        <w:widowControl w:val="0"/>
-        <w:spacing w:after="0" w:line="240" w:lineRule="auto"/>
-        <w:rPr>
-          <w:rFonts w:cs="Times New Roman"/>
-          <w:lang w:val="uk-UA"/>
-        </w:rPr>
-      </w:pPr>
-      <w:r>
-        <w:rPr>
-          <w:rFonts w:cs="Times New Roman"/>
-          <w:b/>
-          <w:lang w:val="uk-UA"/>
-        </w:rPr>
-        <w:t>4. Параметри (</w:t>
-      </w:r>
-      <w:proofErr w:type="spellStart"/>
-      <w:r>
-        <w:rPr>
-          <w:rFonts w:cs="Times New Roman"/>
-          <w:b/>
-          <w:lang w:val="uk-UA"/>
-        </w:rPr>
-        <w:t>конфіг</w:t>
-      </w:r>
-      <w:proofErr w:type="spellEnd"/>
-      <w:r>
-        <w:rPr>
-          <w:rFonts w:cs="Times New Roman"/>
-          <w:b/>
-          <w:lang w:val="uk-UA"/>
-        </w:rPr>
-        <w:t>)</w:t>
-      </w:r>
-    </w:p>
-    <w:p>
-      <w:pPr>
-        <w:widowControl w:val="0"/>
-        <w:spacing w:after="0" w:line="240" w:lineRule="auto"/>
-        <w:rPr>
-          <w:rFonts w:cs="Times New Roman"/>
-          <w:lang w:val="uk-UA"/>
-        </w:rPr>
-      </w:pPr>
-      <w:r>
-        <w:rPr>
-          <w:rFonts w:cs="Times New Roman"/>
-          <w:b/>
-          <w:lang w:val="uk-UA"/>
-        </w:rPr>
-        <w:t>4.1 Основні параметри</w:t>
-      </w:r>
-    </w:p>
-    <w:p>
-      <w:pPr>
-        <w:widowControl w:val="0"/>
-        <w:spacing w:after="0" w:line="240" w:lineRule="auto"/>
-        <w:rPr>
-          <w:rFonts w:cs="Times New Roman"/>
-          <w:lang w:val="uk-UA"/>
-        </w:rPr>
-      </w:pPr>
-      <w:r>
-        <w:rPr>
-          <w:rFonts w:cs="Times New Roman"/>
-          <w:lang w:val="uk-UA"/>
-        </w:rPr>
-        <w:t xml:space="preserve">• </w:t>
-      </w:r>
-      <w:proofErr w:type="spellStart"/>
-      <w:r>
-        <w:rPr>
-          <w:rFonts w:cs="Times New Roman"/>
-          <w:lang w:val="uk-UA"/>
-        </w:rPr>
-        <w:t>mode</w:t>
-      </w:r>
-      <w:proofErr w:type="spellEnd"/>
-      <w:r>
-        <w:rPr>
-          <w:rFonts w:cs="Times New Roman"/>
-          <w:lang w:val="uk-UA"/>
-        </w:rPr>
-        <w:t xml:space="preserve"> </w:t>
-      </w:r>
-      <w:r>
-        <w:rPr>
-          <w:rFonts w:ascii="Cambria Math" w:hAnsi="Cambria Math" w:cs="Cambria Math"/>
-          <w:lang w:val="uk-UA"/>
-        </w:rPr>
-        <w:t>∈</w:t>
-      </w:r>
-      <w:r>
-        <w:rPr>
-          <w:rFonts w:cs="Times New Roman"/>
-          <w:lang w:val="uk-UA"/>
-        </w:rPr>
-        <w:t xml:space="preserve"> {FixedK3, FixedK5, ArbitraryK8bit}.</w:t>
-      </w:r>
-    </w:p>
-    <w:p>
-      <w:pPr>
-        <w:widowControl w:val="0"/>
-        <w:spacing w:after="0" w:line="240" w:lineRule="auto"/>
-        <w:rPr>
-          <w:rFonts w:cs="Times New Roman"/>
-          <w:lang w:val="uk-UA"/>
-        </w:rPr>
-      </w:pPr>
-      <w:r>
-        <w:rPr>
-          <w:rFonts w:cs="Times New Roman"/>
-          <w:lang w:val="uk-UA"/>
-        </w:rPr>
-        <w:t xml:space="preserve">• </w:t>
-      </w:r>
-      <w:proofErr w:type="spellStart"/>
-      <w:r>
-        <w:rPr>
-          <w:rFonts w:cs="Times New Roman"/>
-          <w:lang w:val="uk-UA"/>
-        </w:rPr>
-        <w:t>stride</w:t>
-      </w:r>
-      <w:proofErr w:type="spellEnd"/>
-      <w:r>
-        <w:rPr>
-          <w:rFonts w:cs="Times New Roman"/>
-          <w:lang w:val="uk-UA"/>
-        </w:rPr>
-        <w:t xml:space="preserve"> ≥ 1 — крок відбору кадрів у буфер медіани:</w:t>
-      </w:r>
-    </w:p>
-    <w:p>
-      <w:pPr>
-        <w:widowControl w:val="0"/>
-        <w:spacing w:after="0" w:line="240" w:lineRule="auto"/>
-        <w:rPr>
-          <w:rFonts w:cs="Times New Roman"/>
-          <w:lang w:val="uk-UA"/>
-        </w:rPr>
-      </w:pPr>
-      <w:r>
-        <w:rPr>
-          <w:rFonts w:cs="Times New Roman"/>
-          <w:lang w:val="uk-UA"/>
-        </w:rPr>
-        <w:t xml:space="preserve">   </w:t>
-      </w:r>
-      <w:proofErr w:type="spellStart"/>
-      <w:r>
-        <w:rPr>
-          <w:rFonts w:cs="Times New Roman"/>
-          <w:lang w:val="uk-UA"/>
-        </w:rPr>
-        <w:t>stride</w:t>
-      </w:r>
-      <w:proofErr w:type="spellEnd"/>
-      <w:r>
-        <w:rPr>
-          <w:rFonts w:cs="Times New Roman"/>
-          <w:lang w:val="uk-UA"/>
-        </w:rPr>
-        <w:t xml:space="preserve">=1 → кожний кадр; </w:t>
-      </w:r>
-      <w:proofErr w:type="spellStart"/>
-      <w:r>
-        <w:rPr>
-          <w:rFonts w:cs="Times New Roman"/>
-          <w:lang w:val="uk-UA"/>
-        </w:rPr>
-        <w:t>stride</w:t>
-      </w:r>
-      <w:proofErr w:type="spellEnd"/>
-      <w:r>
-        <w:rPr>
-          <w:rFonts w:cs="Times New Roman"/>
-          <w:lang w:val="uk-UA"/>
-        </w:rPr>
-        <w:t xml:space="preserve">=2 → через 1; </w:t>
-      </w:r>
-      <w:proofErr w:type="spellStart"/>
-      <w:r>
-        <w:rPr>
-          <w:rFonts w:cs="Times New Roman"/>
-          <w:lang w:val="uk-UA"/>
-        </w:rPr>
-        <w:t>stride</w:t>
-      </w:r>
-      <w:proofErr w:type="spellEnd"/>
-      <w:r>
-        <w:rPr>
-          <w:rFonts w:cs="Times New Roman"/>
-          <w:lang w:val="uk-UA"/>
-        </w:rPr>
-        <w:t xml:space="preserve">=3 → через 2; загально — беремо кожний </w:t>
-      </w:r>
-      <w:proofErr w:type="spellStart"/>
-      <w:r>
-        <w:rPr>
-          <w:rFonts w:cs="Times New Roman"/>
-          <w:lang w:val="uk-UA"/>
-        </w:rPr>
-        <w:t>stride</w:t>
-      </w:r>
-      <w:proofErr w:type="spellEnd"/>
-      <w:r>
-        <w:rPr>
-          <w:rFonts w:cs="Times New Roman"/>
-          <w:lang w:val="uk-UA"/>
-        </w:rPr>
-        <w:t>-й кадр.</w:t>
-      </w:r>
-    </w:p>
-    <w:p>
-      <w:pPr>
-        <w:widowControl w:val="0"/>
-        <w:spacing w:after="0" w:line="240" w:lineRule="auto"/>
-        <w:rPr>
-          <w:rFonts w:cs="Times New Roman"/>
-          <w:lang w:val="uk-UA"/>
-        </w:rPr>
-      </w:pPr>
-      <w:r>
-        <w:rPr>
-          <w:rFonts w:cs="Times New Roman"/>
-          <w:lang w:val="uk-UA"/>
-        </w:rPr>
-        <w:t xml:space="preserve">• </w:t>
-      </w:r>
-      <w:proofErr w:type="spellStart"/>
-      <w:r>
-        <w:rPr>
-          <w:rFonts w:cs="Times New Roman"/>
-          <w:lang w:val="uk-UA"/>
-        </w:rPr>
-        <w:t>K_arbitrary</w:t>
-      </w:r>
-      <w:proofErr w:type="spellEnd"/>
-      <w:r>
-        <w:rPr>
-          <w:rFonts w:cs="Times New Roman"/>
-          <w:lang w:val="uk-UA"/>
-        </w:rPr>
-        <w:t xml:space="preserve"> — використовується лише в режимі ArbitraryK8bit: 15 ≤ </w:t>
-      </w:r>
-      <w:proofErr w:type="spellStart"/>
-      <w:r>
-        <w:rPr>
-          <w:rFonts w:cs="Times New Roman"/>
-          <w:lang w:val="uk-UA"/>
-        </w:rPr>
-        <w:t>K_arbitrary</w:t>
-      </w:r>
-      <w:proofErr w:type="spellEnd"/>
-      <w:r>
-        <w:rPr>
-          <w:rFonts w:cs="Times New Roman"/>
-          <w:lang w:val="uk-UA"/>
-        </w:rPr>
-        <w:t xml:space="preserve"> ≤ 50.</w:t>
-      </w:r>
-    </w:p>
-    <w:p>
-      <w:pPr>
-        <w:widowControl w:val="0"/>
-        <w:spacing w:after="0" w:line="240" w:lineRule="auto"/>
-        <w:rPr>
-          <w:rFonts w:cs="Times New Roman"/>
-          <w:lang w:val="uk-UA"/>
-        </w:rPr>
-      </w:pPr>
-      <w:r>
-        <w:rPr>
-          <w:rFonts w:cs="Times New Roman"/>
-          <w:b/>
-          <w:lang w:val="uk-UA"/>
-        </w:rPr>
-        <w:t>4.2 Режим часової симетрії</w:t>
-      </w:r>
-    </w:p>
-    <w:p>
-      <w:pPr>
-        <w:widowControl w:val="0"/>
-        <w:spacing w:after="0" w:line="240" w:lineRule="auto"/>
-        <w:rPr>
-          <w:rFonts w:cs="Times New Roman"/>
-          <w:lang w:val="uk-UA"/>
-        </w:rPr>
-      </w:pPr>
-      <w:proofErr w:type="spellStart"/>
-      <w:r>
-        <w:rPr>
-          <w:rFonts w:cs="Times New Roman"/>
-          <w:lang w:val="uk-UA"/>
-        </w:rPr>
-        <w:t>temporal_mode</w:t>
-      </w:r>
-      <w:proofErr w:type="spellEnd"/>
-      <w:r>
-        <w:rPr>
-          <w:rFonts w:cs="Times New Roman"/>
-          <w:lang w:val="uk-UA"/>
-        </w:rPr>
-        <w:t>:</w:t>
-      </w:r>
-    </w:p>
-    <w:p>
-      <w:pPr>
-        <w:widowControl w:val="0"/>
-        <w:spacing w:after="0" w:line="240" w:lineRule="auto"/>
+      </w:pPr>
+      <w:r>
         <w:rPr>
           <w:rFonts w:cs="Times New Roman"/>
           <w:b/>
@@ -1066,7 +1065,9 @@
           <w:u w:val="single"/>
           <w:lang w:val="uk-UA"/>
         </w:rPr>
-      </w:pPr>
+        <w:t xml:space="preserve">Тут і завжди використовується лише режим </w:t>
+      </w:r>
+      <w:proofErr w:type="spellStart"/>
       <w:r>
         <w:rPr>
           <w:rFonts w:cs="Times New Roman"/>
@@ -1077,10 +1078,204 @@
           <w:u w:val="single"/>
           <w:lang w:val="uk-UA"/>
         </w:rPr>
-        <w:t xml:space="preserve">Тут і завжди використовується лише режим </w:t>
-      </w:r>
-      <w:proofErr w:type="spellStart"/>
-      <w:r>
+        <w:t>Causal</w:t>
+      </w:r>
+      <w:proofErr w:type="spellEnd"/>
+    </w:p>
+    <w:p>
+      <w:pPr>
+        <w:widowControl w:val="0"/>
+        <w:spacing w:after="0" w:line="240" w:lineRule="auto"/>
+        <w:rPr>
+          <w:rFonts w:cs="Times New Roman"/>
+          <w:lang w:val="uk-UA"/>
+        </w:rPr>
+      </w:pPr>
+      <w:r>
+        <w:rPr>
+          <w:rFonts w:cs="Times New Roman"/>
+          <w:lang w:val="uk-UA"/>
+        </w:rPr>
+        <w:t xml:space="preserve">• </w:t>
+      </w:r>
+      <w:proofErr w:type="spellStart"/>
+      <w:r>
+        <w:rPr>
+          <w:rFonts w:cs="Times New Roman"/>
+          <w:lang w:val="uk-UA"/>
+        </w:rPr>
+        <w:t>Centered</w:t>
+      </w:r>
+      <w:proofErr w:type="spellEnd"/>
+      <w:r>
+        <w:rPr>
+          <w:rFonts w:cs="Times New Roman"/>
+          <w:lang w:val="uk-UA"/>
+        </w:rPr>
+        <w:t xml:space="preserve"> (симетричний): використовує кадри {t−s, t, </w:t>
+      </w:r>
+      <w:proofErr w:type="spellStart"/>
+      <w:r>
+        <w:rPr>
+          <w:rFonts w:cs="Times New Roman"/>
+          <w:lang w:val="uk-UA"/>
+        </w:rPr>
+        <w:t>t+s</w:t>
+      </w:r>
+      <w:proofErr w:type="spellEnd"/>
+      <w:r>
+        <w:rPr>
+          <w:rFonts w:cs="Times New Roman"/>
+          <w:lang w:val="uk-UA"/>
+        </w:rPr>
+        <w:t xml:space="preserve">} для K=3; {t−2s, t−s, t, </w:t>
+      </w:r>
+      <w:proofErr w:type="spellStart"/>
+      <w:r>
+        <w:rPr>
+          <w:rFonts w:cs="Times New Roman"/>
+          <w:lang w:val="uk-UA"/>
+        </w:rPr>
+        <w:t>t+s</w:t>
+      </w:r>
+      <w:proofErr w:type="spellEnd"/>
+      <w:r>
+        <w:rPr>
+          <w:rFonts w:cs="Times New Roman"/>
+          <w:lang w:val="uk-UA"/>
+        </w:rPr>
+        <w:t>, t+2s} для K=5; для довільного K — центроване вікно розміру K з кроком s=</w:t>
+      </w:r>
+      <w:proofErr w:type="spellStart"/>
+      <w:r>
+        <w:rPr>
+          <w:rFonts w:cs="Times New Roman"/>
+          <w:lang w:val="uk-UA"/>
+        </w:rPr>
+        <w:t>stride</w:t>
+      </w:r>
+      <w:proofErr w:type="spellEnd"/>
+      <w:r>
+        <w:rPr>
+          <w:rFonts w:cs="Times New Roman"/>
+          <w:lang w:val="uk-UA"/>
+        </w:rPr>
+        <w:t xml:space="preserve">. Потрібна затримка </w:t>
+      </w:r>
+      <w:proofErr w:type="spellStart"/>
+      <w:r>
+        <w:rPr>
+          <w:rFonts w:cs="Times New Roman"/>
+          <w:lang w:val="uk-UA"/>
+        </w:rPr>
+        <w:t>latency</w:t>
+      </w:r>
+      <w:proofErr w:type="spellEnd"/>
+      <w:r>
+        <w:rPr>
+          <w:rFonts w:cs="Times New Roman"/>
+          <w:lang w:val="uk-UA"/>
+        </w:rPr>
+        <w:t xml:space="preserve"> = </w:t>
+      </w:r>
+      <w:proofErr w:type="spellStart"/>
+      <w:r>
+        <w:rPr>
+          <w:rFonts w:cs="Times New Roman"/>
+          <w:lang w:val="uk-UA"/>
+        </w:rPr>
+        <w:t>stride</w:t>
+      </w:r>
+      <w:proofErr w:type="spellEnd"/>
+      <w:r>
+        <w:rPr>
+          <w:rFonts w:cs="Times New Roman"/>
+          <w:lang w:val="uk-UA"/>
+        </w:rPr>
+        <w:t>·(K//2) кадрів.</w:t>
+      </w:r>
+    </w:p>
+    <w:p>
+      <w:pPr>
+        <w:widowControl w:val="0"/>
+        <w:spacing w:after="0" w:line="240" w:lineRule="auto"/>
+        <w:rPr>
+          <w:rFonts w:cs="Times New Roman"/>
+          <w:lang w:val="uk-UA"/>
+        </w:rPr>
+      </w:pPr>
+      <w:r>
+        <w:rPr>
+          <w:rFonts w:cs="Times New Roman"/>
+          <w:lang w:val="uk-UA"/>
+        </w:rPr>
+        <w:t xml:space="preserve">• </w:t>
+      </w:r>
+      <w:proofErr w:type="spellStart"/>
+      <w:r>
+        <w:rPr>
+          <w:rFonts w:cs="Times New Roman"/>
+          <w:lang w:val="uk-UA"/>
+        </w:rPr>
+        <w:t>Causal</w:t>
+      </w:r>
+      <w:proofErr w:type="spellEnd"/>
+      <w:r>
+        <w:rPr>
+          <w:rFonts w:cs="Times New Roman"/>
+          <w:lang w:val="uk-UA"/>
+        </w:rPr>
+        <w:t xml:space="preserve"> (каузальний): використовує лише минулі кадри (без 'майбутніх'), затримка 0 кадрів.</w:t>
+      </w:r>
+    </w:p>
+    <w:p>
+      <w:pPr>
+        <w:widowControl w:val="0"/>
+        <w:spacing w:after="0" w:line="240" w:lineRule="auto"/>
+        <w:rPr>
+          <w:rFonts w:cs="Times New Roman"/>
+          <w:lang w:val="uk-UA"/>
+        </w:rPr>
+      </w:pPr>
+      <w:r>
+        <w:rPr>
+          <w:rFonts w:cs="Times New Roman"/>
+          <w:b/>
+          <w:lang w:val="uk-UA"/>
+        </w:rPr>
+        <w:t>4.3 Режим формування виходу для пропущених кадрів</w:t>
+      </w:r>
+    </w:p>
+    <w:p>
+      <w:pPr>
+        <w:widowControl w:val="0"/>
+        <w:spacing w:after="0" w:line="240" w:lineRule="auto"/>
+        <w:rPr>
+          <w:rFonts w:cs="Times New Roman"/>
+          <w:lang w:val="uk-UA"/>
+        </w:rPr>
+      </w:pPr>
+      <w:proofErr w:type="spellStart"/>
+      <w:r>
+        <w:rPr>
+          <w:rFonts w:cs="Times New Roman"/>
+          <w:lang w:val="uk-UA"/>
+        </w:rPr>
+        <w:t>output_mode</w:t>
+      </w:r>
+      <w:proofErr w:type="spellEnd"/>
+      <w:r>
+        <w:rPr>
+          <w:rFonts w:cs="Times New Roman"/>
+          <w:lang w:val="uk-UA"/>
+        </w:rPr>
+        <w:t>:</w:t>
+      </w:r>
+    </w:p>
+    <w:p>
+      <w:pPr>
+        <w:widowControl w:val="0"/>
+        <w:spacing w:after="0" w:line="240" w:lineRule="auto"/>
         <w:rPr>
           <w:rFonts w:cs="Times New Roman"/>
           <w:b/>
@@ -1090,204 +1285,8 @@
           <w:u w:val="single"/>
           <w:lang w:val="uk-UA"/>
         </w:rPr>
-        <w:t>Causal</w:t>
-      </w:r>
-      <w:proofErr w:type="spellEnd"/>
-    </w:p>
-    <w:p>
-      <w:pPr>
-        <w:widowControl w:val="0"/>
-        <w:spacing w:after="0" w:line="240" w:lineRule="auto"/>
-        <w:rPr>
-          <w:rFonts w:cs="Times New Roman"/>
-          <w:lang w:val="uk-UA"/>
-        </w:rPr>
-      </w:pPr>
-      <w:r>
-        <w:rPr>
-          <w:rFonts w:cs="Times New Roman"/>
-          <w:lang w:val="uk-UA"/>
-        </w:rPr>
-        <w:t xml:space="preserve">• </w:t>
-      </w:r>
-      <w:proofErr w:type="spellStart"/>
-      <w:r>
-        <w:rPr>
-          <w:rFonts w:cs="Times New Roman"/>
-          <w:lang w:val="uk-UA"/>
-        </w:rPr>
-        <w:t>Centered</w:t>
-      </w:r>
-      <w:proofErr w:type="spellEnd"/>
-      <w:r>
-        <w:rPr>
-          <w:rFonts w:cs="Times New Roman"/>
-          <w:lang w:val="uk-UA"/>
-        </w:rPr>
-        <w:t xml:space="preserve"> (симетричний): використовує кадри {t−s, t, </w:t>
-      </w:r>
-      <w:proofErr w:type="spellStart"/>
-      <w:r>
-        <w:rPr>
-          <w:rFonts w:cs="Times New Roman"/>
-          <w:lang w:val="uk-UA"/>
-        </w:rPr>
-        <w:t>t+s</w:t>
-      </w:r>
-      <w:proofErr w:type="spellEnd"/>
-      <w:r>
-        <w:rPr>
-          <w:rFonts w:cs="Times New Roman"/>
-          <w:lang w:val="uk-UA"/>
-        </w:rPr>
-        <w:t xml:space="preserve">} для K=3; {t−2s, t−s, t, </w:t>
-      </w:r>
-      <w:proofErr w:type="spellStart"/>
-      <w:r>
-        <w:rPr>
-          <w:rFonts w:cs="Times New Roman"/>
-          <w:lang w:val="uk-UA"/>
-        </w:rPr>
-        <w:t>t+s</w:t>
-      </w:r>
-      <w:proofErr w:type="spellEnd"/>
-      <w:r>
-        <w:rPr>
-          <w:rFonts w:cs="Times New Roman"/>
-          <w:lang w:val="uk-UA"/>
-        </w:rPr>
-        <w:t>, t+2s} для K=5; для довільного K — центроване вікно розміру K з кроком s=</w:t>
-      </w:r>
-      <w:proofErr w:type="spellStart"/>
-      <w:r>
-        <w:rPr>
-          <w:rFonts w:cs="Times New Roman"/>
-          <w:lang w:val="uk-UA"/>
-        </w:rPr>
-        <w:t>stride</w:t>
-      </w:r>
-      <w:proofErr w:type="spellEnd"/>
-      <w:r>
-        <w:rPr>
-          <w:rFonts w:cs="Times New Roman"/>
-          <w:lang w:val="uk-UA"/>
-        </w:rPr>
-        <w:t xml:space="preserve">. Потрібна затримка </w:t>
-      </w:r>
-      <w:proofErr w:type="spellStart"/>
-      <w:r>
-        <w:rPr>
-          <w:rFonts w:cs="Times New Roman"/>
-          <w:lang w:val="uk-UA"/>
-        </w:rPr>
-        <w:t>latency</w:t>
-      </w:r>
-      <w:proofErr w:type="spellEnd"/>
-      <w:r>
-        <w:rPr>
-          <w:rFonts w:cs="Times New Roman"/>
-          <w:lang w:val="uk-UA"/>
-        </w:rPr>
-        <w:t xml:space="preserve"> = </w:t>
-      </w:r>
-      <w:proofErr w:type="spellStart"/>
-      <w:r>
-        <w:rPr>
-          <w:rFonts w:cs="Times New Roman"/>
-          <w:lang w:val="uk-UA"/>
-        </w:rPr>
-        <w:t>stride</w:t>
-      </w:r>
-      <w:proofErr w:type="spellEnd"/>
-      <w:r>
-        <w:rPr>
-          <w:rFonts w:cs="Times New Roman"/>
-          <w:lang w:val="uk-UA"/>
-        </w:rPr>
-        <w:t>·(K//2) кадрів.</w:t>
-      </w:r>
-    </w:p>
-    <w:p>
-      <w:pPr>
-        <w:widowControl w:val="0"/>
-        <w:spacing w:after="0" w:line="240" w:lineRule="auto"/>
-        <w:rPr>
-          <w:rFonts w:cs="Times New Roman"/>
-          <w:lang w:val="uk-UA"/>
-        </w:rPr>
-      </w:pPr>
-      <w:r>
-        <w:rPr>
-          <w:rFonts w:cs="Times New Roman"/>
-          <w:lang w:val="uk-UA"/>
-        </w:rPr>
-        <w:t xml:space="preserve">• </w:t>
-      </w:r>
-      <w:proofErr w:type="spellStart"/>
-      <w:r>
-        <w:rPr>
-          <w:rFonts w:cs="Times New Roman"/>
-          <w:lang w:val="uk-UA"/>
-        </w:rPr>
-        <w:t>Causal</w:t>
-      </w:r>
-      <w:proofErr w:type="spellEnd"/>
-      <w:r>
-        <w:rPr>
-          <w:rFonts w:cs="Times New Roman"/>
-          <w:lang w:val="uk-UA"/>
-        </w:rPr>
-        <w:t xml:space="preserve"> (каузальний): використовує лише минулі кадри (без 'майбутніх'), затримка 0 кадрів.</w:t>
-      </w:r>
-    </w:p>
-    <w:p>
-      <w:pPr>
-        <w:widowControl w:val="0"/>
-        <w:spacing w:after="0" w:line="240" w:lineRule="auto"/>
-        <w:rPr>
-          <w:rFonts w:cs="Times New Roman"/>
-          <w:lang w:val="uk-UA"/>
-        </w:rPr>
-      </w:pPr>
-      <w:r>
-        <w:rPr>
-          <w:rFonts w:cs="Times New Roman"/>
-          <w:b/>
-          <w:lang w:val="uk-UA"/>
-        </w:rPr>
-        <w:t>4.3 Режим формування виходу для пропущених кадрів</w:t>
-      </w:r>
-    </w:p>
-    <w:p>
-      <w:pPr>
-        <w:widowControl w:val="0"/>
-        <w:spacing w:after="0" w:line="240" w:lineRule="auto"/>
-        <w:rPr>
-          <w:rFonts w:cs="Times New Roman"/>
-          <w:lang w:val="uk-UA"/>
-        </w:rPr>
-      </w:pPr>
-      <w:proofErr w:type="spellStart"/>
-      <w:r>
-        <w:rPr>
-          <w:rFonts w:cs="Times New Roman"/>
-          <w:lang w:val="uk-UA"/>
-        </w:rPr>
-        <w:t>output_mode</w:t>
-      </w:r>
-      <w:proofErr w:type="spellEnd"/>
-      <w:r>
-        <w:rPr>
-          <w:rFonts w:cs="Times New Roman"/>
-          <w:lang w:val="uk-UA"/>
-        </w:rPr>
-        <w:t>:</w:t>
-      </w:r>
-    </w:p>
-    <w:p>
-      <w:pPr>
-        <w:widowControl w:val="0"/>
-        <w:spacing w:after="0" w:line="240" w:lineRule="auto"/>
+      </w:pPr>
+      <w:r>
         <w:rPr>
           <w:rFonts w:cs="Times New Roman"/>
           <w:b/>
@@ -1297,30 +1296,7 @@
           <w:u w:val="single"/>
           <w:lang w:val="uk-UA"/>
         </w:rPr>
-      </w:pPr>
-      <w:r>
-        <w:rPr>
-          <w:rFonts w:cs="Times New Roman"/>
-          <w:b/>
-          <w:bCs/>
-          <w:i/>
-          <w:iCs/>
-          <w:u w:val="single"/>
-          <w:lang w:val="uk-UA"/>
-        </w:rPr>
-        <w:t>Тут і завжди використовується лише режим</w:t>
-      </w:r>
-      <w:r>
-        <w:rPr>
-          <w:rFonts w:cs="Times New Roman"/>
-          <w:b/>
-          <w:bCs/>
-          <w:i/>
-          <w:iCs/>
-          <w:u w:val="single"/>
-          <w:lang w:val="uk-UA"/>
-        </w:rPr>
-        <w:t xml:space="preserve"> </w:t>
+        <w:t xml:space="preserve">Тут і завжди використовується лише режим </w:t>
       </w:r>
       <w:proofErr w:type="spellStart"/>
       <w:r>
@@ -2367,84 +2343,7 @@
           <w:rFonts w:cs="Times New Roman"/>
           <w:lang w:val="uk-UA"/>
         </w:rPr>
-        <w:t>два різних ядра FixedK3</w:t>
-      </w:r>
-      <w:r>
-        <w:rPr>
-          <w:rFonts w:cs="Times New Roman"/>
-          <w:lang w:val="uk-UA"/>
-        </w:rPr>
-        <w:t xml:space="preserve"> (</w:t>
-      </w:r>
-      <w:r>
-        <w:rPr>
-          <w:rFonts w:cs="Times New Roman"/>
-          <w:lang w:val="uk-UA"/>
-        </w:rPr>
-        <w:t>K=3</w:t>
-      </w:r>
-      <w:r>
-        <w:rPr>
-          <w:rFonts w:cs="Times New Roman"/>
-          <w:lang w:val="uk-UA"/>
-        </w:rPr>
-        <w:t>),</w:t>
-      </w:r>
-      <w:r>
-        <w:rPr>
-          <w:rFonts w:cs="Times New Roman"/>
-          <w:lang w:val="uk-UA"/>
-        </w:rPr>
-        <w:t xml:space="preserve"> FixedK</w:t>
-      </w:r>
-      <w:r>
-        <w:rPr>
-          <w:rFonts w:cs="Times New Roman"/>
-          <w:lang w:val="uk-UA"/>
-        </w:rPr>
-        <w:t>5 (</w:t>
-      </w:r>
-      <w:r>
-        <w:rPr>
-          <w:rFonts w:cs="Times New Roman"/>
-          <w:lang w:val="uk-UA"/>
-        </w:rPr>
-        <w:t>K=5</w:t>
-      </w:r>
-      <w:r>
-        <w:rPr>
-          <w:rFonts w:cs="Times New Roman"/>
-          <w:lang w:val="uk-UA"/>
-        </w:rPr>
-        <w:t>)</w:t>
-      </w:r>
-      <w:r>
-        <w:rPr>
-          <w:rFonts w:cs="Times New Roman"/>
-          <w:lang w:val="uk-UA"/>
-        </w:rPr>
-        <w:t>,</w:t>
-      </w:r>
-      <w:r>
-        <w:rPr>
-          <w:rFonts w:cs="Times New Roman"/>
-          <w:lang w:val="uk-UA"/>
-        </w:rPr>
-        <w:t xml:space="preserve"> </w:t>
-      </w:r>
-      <w:r>
-        <w:rPr>
-          <w:rFonts w:cs="Times New Roman"/>
-          <w:lang w:val="uk-UA"/>
-        </w:rPr>
-        <w:t>ArbitraryK8bit</w:t>
-      </w:r>
-      <w:r>
-        <w:rPr>
-          <w:rFonts w:cs="Times New Roman"/>
-          <w:lang w:val="uk-UA"/>
-        </w:rPr>
-        <w:t xml:space="preserve"> (К=)</w:t>
+        <w:t>два різних ядра FixedK3 (K=3), FixedK5 (K=5), ArbitraryK8bit (К=)</w:t>
       </w:r>
     </w:p>
     <w:p>
@@ -2523,14 +2422,12 @@
         <w:spacing w:after="0" w:line="240" w:lineRule="auto"/>
         <w:rPr>
           <w:rFonts w:cs="Times New Roman"/>
-          <w:color w:val="00B0F0"/>
-          <w:lang w:val="uk-UA"/>
-        </w:rPr>
-      </w:pPr>
-      <w:r>
-        <w:rPr>
-          <w:rFonts w:cs="Times New Roman"/>
-          <w:color w:val="00B0F0"/>
+          <w:lang w:val="uk-UA"/>
+        </w:rPr>
+      </w:pPr>
+      <w:r>
+        <w:rPr>
+          <w:rFonts w:cs="Times New Roman"/>
           <w:lang w:val="uk-UA"/>
         </w:rPr>
         <w:t xml:space="preserve">“Мінімум алокацій у </w:t>
@@ -2539,7 +2436,6 @@
       <w:r>
         <w:rPr>
           <w:rFonts w:cs="Times New Roman"/>
-          <w:color w:val="00B0F0"/>
           <w:lang w:val="uk-UA"/>
         </w:rPr>
         <w:t>processFrame</w:t>
@@ -2548,7 +2444,6 @@
       <w:r>
         <w:rPr>
           <w:rFonts w:cs="Times New Roman"/>
-          <w:color w:val="00B0F0"/>
           <w:lang w:val="uk-UA"/>
         </w:rPr>
         <w:t>” означає:</w:t>
@@ -2564,14 +2459,12 @@
         <w:spacing w:after="0" w:line="240" w:lineRule="auto"/>
         <w:rPr>
           <w:rFonts w:cs="Times New Roman"/>
-          <w:color w:val="00B0F0"/>
-          <w:lang w:val="uk-UA"/>
-        </w:rPr>
-      </w:pPr>
-      <w:r>
-        <w:rPr>
-          <w:rFonts w:cs="Times New Roman"/>
-          <w:color w:val="00B0F0"/>
+          <w:lang w:val="uk-UA"/>
+        </w:rPr>
+      </w:pPr>
+      <w:r>
+        <w:rPr>
+          <w:rFonts w:cs="Times New Roman"/>
           <w:lang w:val="uk-UA"/>
         </w:rPr>
         <w:t xml:space="preserve">У функції обробки </w:t>
@@ -2581,7 +2474,6 @@
           <w:rFonts w:cs="Times New Roman"/>
           <w:b/>
           <w:bCs/>
-          <w:color w:val="00B0F0"/>
           <w:lang w:val="uk-UA"/>
         </w:rPr>
         <w:t xml:space="preserve">не створювати нові масиви, </w:t>
@@ -2592,7 +2484,6 @@
           <w:rFonts w:cs="Times New Roman"/>
           <w:b/>
           <w:bCs/>
-          <w:color w:val="00B0F0"/>
           <w:lang w:val="uk-UA"/>
         </w:rPr>
         <w:t>std</w:t>
@@ -2603,7 +2494,6 @@
           <w:rFonts w:cs="Times New Roman"/>
           <w:b/>
           <w:bCs/>
-          <w:color w:val="00B0F0"/>
           <w:lang w:val="uk-UA"/>
         </w:rPr>
         <w:t>::</w:t>
@@ -2614,7 +2504,6 @@
           <w:rFonts w:cs="Times New Roman"/>
           <w:b/>
           <w:bCs/>
-          <w:color w:val="00B0F0"/>
           <w:lang w:val="uk-UA"/>
         </w:rPr>
         <w:t>vector</w:t>
@@ -2625,7 +2514,6 @@
           <w:rFonts w:cs="Times New Roman"/>
           <w:b/>
           <w:bCs/>
-          <w:color w:val="00B0F0"/>
           <w:lang w:val="uk-UA"/>
         </w:rPr>
         <w:t>, cv::</w:t>
@@ -2636,7 +2524,6 @@
           <w:rFonts w:cs="Times New Roman"/>
           <w:b/>
           <w:bCs/>
-          <w:color w:val="00B0F0"/>
           <w:lang w:val="uk-UA"/>
         </w:rPr>
         <w:t>Mat</w:t>
@@ -2647,7 +2534,6 @@
           <w:rFonts w:cs="Times New Roman"/>
           <w:b/>
           <w:bCs/>
-          <w:color w:val="00B0F0"/>
           <w:lang w:val="uk-UA"/>
         </w:rPr>
         <w:t xml:space="preserve"> тощо</w:t>
@@ -2655,7 +2541,6 @@
       <w:r>
         <w:rPr>
           <w:rFonts w:cs="Times New Roman"/>
-          <w:color w:val="00B0F0"/>
           <w:lang w:val="uk-UA"/>
         </w:rPr>
         <w:t xml:space="preserve"> на кожному кадрі.</w:t>
@@ -2671,14 +2556,12 @@
         <w:spacing w:after="0" w:line="240" w:lineRule="auto"/>
         <w:rPr>
           <w:rFonts w:cs="Times New Roman"/>
-          <w:color w:val="00B0F0"/>
-          <w:lang w:val="uk-UA"/>
-        </w:rPr>
-      </w:pPr>
-      <w:r>
-        <w:rPr>
-          <w:rFonts w:cs="Times New Roman"/>
-          <w:color w:val="00B0F0"/>
+          <w:lang w:val="uk-UA"/>
+        </w:rPr>
+      </w:pPr>
+      <w:r>
+        <w:rPr>
+          <w:rFonts w:cs="Times New Roman"/>
           <w:lang w:val="uk-UA"/>
         </w:rPr>
         <w:t xml:space="preserve">Усі буфери (кільцевий буфер кадрів, медіанний кадр, службові масиви) виділяються </w:t>
@@ -2688,7 +2571,6 @@
           <w:rFonts w:cs="Times New Roman"/>
           <w:b/>
           <w:bCs/>
-          <w:color w:val="00B0F0"/>
           <w:lang w:val="uk-UA"/>
         </w:rPr>
         <w:t>один раз</w:t>
@@ -2696,7 +2578,6 @@
       <w:r>
         <w:rPr>
           <w:rFonts w:cs="Times New Roman"/>
-          <w:color w:val="00B0F0"/>
           <w:lang w:val="uk-UA"/>
         </w:rPr>
         <w:t xml:space="preserve"> у конструкторі або </w:t>
@@ -2705,7 +2586,6 @@
       <w:r>
         <w:rPr>
           <w:rFonts w:cs="Times New Roman"/>
-          <w:color w:val="00B0F0"/>
           <w:lang w:val="uk-UA"/>
         </w:rPr>
         <w:t>reset</w:t>
@@ -2714,7 +2594,6 @@
       <w:r>
         <w:rPr>
           <w:rFonts w:cs="Times New Roman"/>
-          <w:color w:val="00B0F0"/>
           <w:lang w:val="uk-UA"/>
         </w:rPr>
         <w:t>().</w:t>
@@ -2730,15 +2609,13 @@
         <w:spacing w:after="0" w:line="240" w:lineRule="auto"/>
         <w:rPr>
           <w:rFonts w:cs="Times New Roman"/>
-          <w:color w:val="00B0F0"/>
-          <w:lang w:val="uk-UA"/>
-        </w:rPr>
-      </w:pPr>
-      <w:proofErr w:type="spellStart"/>
-      <w:r>
-        <w:rPr>
-          <w:rFonts w:cs="Times New Roman"/>
-          <w:color w:val="00B0F0"/>
+          <w:lang w:val="uk-UA"/>
+        </w:rPr>
+      </w:pPr>
+      <w:proofErr w:type="spellStart"/>
+      <w:r>
+        <w:rPr>
+          <w:rFonts w:cs="Times New Roman"/>
           <w:lang w:val="uk-UA"/>
         </w:rPr>
         <w:t>processFrame</w:t>
@@ -2747,7 +2624,6 @@
       <w:r>
         <w:rPr>
           <w:rFonts w:cs="Times New Roman"/>
-          <w:color w:val="00B0F0"/>
           <w:lang w:val="uk-UA"/>
         </w:rPr>
         <w:t xml:space="preserve"> повинен лише </w:t>
@@ -2757,7 +2633,6 @@
           <w:rFonts w:cs="Times New Roman"/>
           <w:b/>
           <w:bCs/>
-          <w:color w:val="00B0F0"/>
           <w:lang w:val="uk-UA"/>
         </w:rPr>
         <w:t>працювати з уже виділеною пам’яттю</w:t>
@@ -2765,7 +2640,6 @@
       <w:r>
         <w:rPr>
           <w:rFonts w:cs="Times New Roman"/>
-          <w:color w:val="00B0F0"/>
           <w:lang w:val="uk-UA"/>
         </w:rPr>
         <w:t>.</w:t>
@@ -2781,14 +2655,12 @@
         <w:spacing w:after="0" w:line="240" w:lineRule="auto"/>
         <w:rPr>
           <w:rFonts w:cs="Times New Roman"/>
-          <w:color w:val="00B0F0"/>
-          <w:lang w:val="uk-UA"/>
-        </w:rPr>
-      </w:pPr>
-      <w:r>
-        <w:rPr>
-          <w:rFonts w:cs="Times New Roman"/>
-          <w:color w:val="00B0F0"/>
+          <w:lang w:val="uk-UA"/>
+        </w:rPr>
+      </w:pPr>
+      <w:r>
+        <w:rPr>
+          <w:rFonts w:cs="Times New Roman"/>
           <w:lang w:val="uk-UA"/>
         </w:rPr>
         <w:t xml:space="preserve">Динамічні алокації всередині гарячого циклу сильно б’ють по FPS через </w:t>
@@ -2797,7 +2669,6 @@
       <w:r>
         <w:rPr>
           <w:rFonts w:cs="Times New Roman"/>
-          <w:color w:val="00B0F0"/>
           <w:lang w:val="uk-UA"/>
         </w:rPr>
         <w:t>heap</w:t>
@@ -2806,7 +2677,6 @@
       <w:r>
         <w:rPr>
           <w:rFonts w:cs="Times New Roman"/>
-          <w:color w:val="00B0F0"/>
           <w:lang w:val="uk-UA"/>
         </w:rPr>
         <w:t>-операції.</w:t>
@@ -2822,14 +2692,12 @@
         <w:spacing w:after="0" w:line="240" w:lineRule="auto"/>
         <w:rPr>
           <w:rFonts w:cs="Times New Roman"/>
-          <w:color w:val="00B0F0"/>
-          <w:lang w:val="uk-UA"/>
-        </w:rPr>
-      </w:pPr>
-      <w:r>
-        <w:rPr>
-          <w:rFonts w:cs="Times New Roman"/>
-          <w:color w:val="00B0F0"/>
+          <w:lang w:val="uk-UA"/>
+        </w:rPr>
+      </w:pPr>
+      <w:r>
+        <w:rPr>
+          <w:rFonts w:cs="Times New Roman"/>
           <w:lang w:val="uk-UA"/>
         </w:rPr>
         <w:t xml:space="preserve">Для </w:t>
@@ -2838,7 +2706,6 @@
       <w:r>
         <w:rPr>
           <w:rFonts w:cs="Times New Roman"/>
-          <w:color w:val="00B0F0"/>
           <w:lang w:val="uk-UA"/>
         </w:rPr>
         <w:t>high</w:t>
@@ -2847,7 +2714,6 @@
       <w:r>
         <w:rPr>
           <w:rFonts w:cs="Times New Roman"/>
-          <w:color w:val="00B0F0"/>
           <w:lang w:val="uk-UA"/>
         </w:rPr>
         <w:t>-FPS це критично: навіть одна зайва алокація на кадр може стати вузьким місцем.</w:t>
@@ -4736,6 +4602,77 @@
           <w:lang w:val="uk-UA"/>
         </w:rPr>
         <w:t>[i]</w:t>
+      </w:r>
+    </w:p>
+    <w:p>
+      <w:pPr>
+        <w:widowControl w:val="0"/>
+        <w:spacing w:after="0" w:line="240" w:lineRule="auto"/>
+        <w:rPr>
+          <w:rFonts w:cs="Times New Roman"/>
+          <w:color w:val="FF0000"/>
+          <w:lang w:val="uk-UA"/>
+        </w:rPr>
+      </w:pPr>
+      <w:r>
+        <w:rPr>
+          <w:rFonts w:cs="Times New Roman"/>
+          <w:color w:val="FF0000"/>
+          <w:szCs w:val="24"/>
+          <w:lang w:val="uk-UA"/>
+        </w:rPr>
+        <w:t xml:space="preserve">Оскільки операція обчислення </w:t>
+      </w:r>
+      <w:r>
+        <w:rPr>
+          <w:rFonts w:cs="Times New Roman"/>
+          <w:color w:val="FF0000"/>
+          <w:szCs w:val="24"/>
+        </w:rPr>
+        <w:t>residual</w:t>
+      </w:r>
+      <w:r>
+        <w:rPr>
+          <w:rFonts w:cs="Times New Roman"/>
+          <w:color w:val="FF0000"/>
+          <w:szCs w:val="24"/>
+          <w:lang w:val="uk-UA"/>
+        </w:rPr>
+        <w:t xml:space="preserve"> (</w:t>
+      </w:r>
+      <w:r>
+        <w:rPr>
+          <w:rFonts w:cs="Times New Roman"/>
+          <w:color w:val="FF0000"/>
+          <w:szCs w:val="24"/>
+        </w:rPr>
+        <w:t>I</w:t>
+      </w:r>
+      <w:r>
+        <w:rPr>
+          <w:rFonts w:cs="Times New Roman"/>
+          <w:color w:val="FF0000"/>
+          <w:szCs w:val="24"/>
+          <w:lang w:val="uk-UA"/>
+        </w:rPr>
+        <w:t xml:space="preserve"> − </w:t>
+      </w:r>
+      <w:r>
+        <w:rPr>
+          <w:rFonts w:cs="Times New Roman"/>
+          <w:color w:val="FF0000"/>
+          <w:szCs w:val="24"/>
+        </w:rPr>
+        <w:t>Med</w:t>
+      </w:r>
+      <w:r>
+        <w:rPr>
+          <w:rFonts w:cs="Times New Roman"/>
+          <w:color w:val="FF0000"/>
+          <w:szCs w:val="24"/>
+          <w:lang w:val="uk-UA"/>
+        </w:rPr>
+        <w:t>) може призводити до розширення діапазону значень яскравості (включаючи від’ємні значення), використовується знаковий тип підвищеної розрядності.</w:t>
       </w:r>
     </w:p>
     <w:p>

</xml_diff>